<commit_message>
docs: rebuild final defense deck
</commit_message>
<xml_diff>
--- a/docx/final/20_结题答辩提纲.docx
+++ b/docx/final/20_结题答辩提纲.docx
@@ -28,7 +28,7 @@
         </w:p>
       </w:sdtContent>
     </w:sdt>
-    <w:bookmarkStart w:id="37" w:name="工业轴承设备剩余寿命预测系统的实现结题答辩提纲"/>
+    <w:bookmarkStart w:id="39" w:name="工业轴承设备剩余寿命预测系统的实现结题答辩提纲"/>
     <w:p>
       <w:pPr>
         <w:pStyle w:val="Heading1"/>
@@ -471,7 +471,7 @@
                 <w:color w:val="000000"/>
                 <w:sz w:val="21"/>
               </w:rPr>
-              <w:t xml:space="preserve">V3.0</w:t>
+              <w:t xml:space="preserve">V4.0</w:t>
             </w:r>
           </w:p>
         </w:tc>
@@ -579,7 +579,7 @@
                 <w:color w:val="000000"/>
                 <w:sz w:val="21"/>
               </w:rPr>
-              <w:t xml:space="preserve">答辩结构、每页要点、时间分配和备答重点</w:t>
+              <w:t xml:space="preserve">16 页答辩结构、每页要点、时间分配和备答重点</w:t>
             </w:r>
           </w:p>
         </w:tc>
@@ -905,7 +905,77 @@
                 <w:color w:val="000000"/>
                 <w:sz w:val="21"/>
               </w:rPr>
-              <w:t xml:space="preserve">参考课程交付样例统一封面与归档格式，补充数据理解、技术难点、测试验收和 DOCX 交付信息</w:t>
+              <w:t xml:space="preserve">补充数据理解、技术难点、测试验收和 DOCX 交付信息</w:t>
+            </w:r>
+          </w:p>
+        </w:tc>
+      </w:tr>
+      <w:tr>
+        <w:tc>
+          <w:p>
+            <w:pPr>
+              <w:pStyle w:val="Compact"/>
+              <w:ind w:firstLine="0"/>
+              <w:jc w:val="left"/>
+            </w:pPr>
+            <w:r>
+              <w:rPr>
+                <w:rFonts w:ascii="宋体" w:hAnsi="宋体" w:eastAsia="宋体"/>
+                <w:color w:val="000000"/>
+                <w:sz w:val="21"/>
+              </w:rPr>
+              <w:t xml:space="preserve">V4.0</w:t>
+            </w:r>
+          </w:p>
+        </w:tc>
+        <w:tc>
+          <w:p>
+            <w:pPr>
+              <w:pStyle w:val="Compact"/>
+              <w:ind w:firstLine="0"/>
+              <w:jc w:val="left"/>
+            </w:pPr>
+            <w:r>
+              <w:rPr>
+                <w:rFonts w:ascii="宋体" w:hAnsi="宋体" w:eastAsia="宋体"/>
+                <w:color w:val="000000"/>
+                <w:sz w:val="21"/>
+              </w:rPr>
+              <w:t xml:space="preserve">2026-06-14</w:t>
+            </w:r>
+          </w:p>
+        </w:tc>
+        <w:tc>
+          <w:p>
+            <w:pPr>
+              <w:pStyle w:val="Compact"/>
+              <w:ind w:firstLine="0"/>
+              <w:jc w:val="left"/>
+            </w:pPr>
+            <w:r>
+              <w:rPr>
+                <w:rFonts w:ascii="宋体" w:hAnsi="宋体" w:eastAsia="宋体"/>
+                <w:color w:val="000000"/>
+                <w:sz w:val="21"/>
+              </w:rPr>
+              <w:t xml:space="preserve">项目组</w:t>
+            </w:r>
+          </w:p>
+        </w:tc>
+        <w:tc>
+          <w:p>
+            <w:pPr>
+              <w:pStyle w:val="Compact"/>
+              <w:ind w:firstLine="0"/>
+              <w:jc w:val="left"/>
+            </w:pPr>
+            <w:r>
+              <w:rPr>
+                <w:rFonts w:ascii="宋体" w:hAnsi="宋体" w:eastAsia="宋体"/>
+                <w:color w:val="000000"/>
+                <w:sz w:val="21"/>
+              </w:rPr>
+              <w:t xml:space="preserve">按 16 页新版网页 PPT 重构论文复现、指标解释和数据特征叙事</w:t>
             </w:r>
           </w:p>
         </w:tc>
@@ -940,7 +1010,7 @@
           <w:rFonts w:ascii="宋体" w:hAnsi="宋体" w:eastAsia="宋体"/>
           <w:color w:val="000000"/>
         </w:rPr>
-        <w:t xml:space="preserve">项目名称：工业轴承设备剩余寿命预测系统的实现</w:t>
+        <w:t xml:space="preserve">项目名称：工业轴承设备剩余寿命预测系统的实现。</w:t>
       </w:r>
     </w:p>
     <w:p>
@@ -958,7 +1028,7 @@
           <w:rFonts w:ascii="宋体" w:hAnsi="宋体" w:eastAsia="宋体"/>
           <w:color w:val="000000"/>
         </w:rPr>
-        <w:t xml:space="preserve">课程：中国科学技术大学软件学院《软件工程》</w:t>
+        <w:t xml:space="preserve">课程：中国科学技术大学软件学院《软件工程》。</w:t>
       </w:r>
     </w:p>
     <w:p>
@@ -976,7 +1046,7 @@
           <w:rFonts w:ascii="宋体" w:hAnsi="宋体" w:eastAsia="宋体"/>
           <w:color w:val="000000"/>
         </w:rPr>
-        <w:t xml:space="preserve">指导老师：zjf</w:t>
+        <w:t xml:space="preserve">指导老师：zjf。</w:t>
       </w:r>
     </w:p>
     <w:p>
@@ -994,7 +1064,7 @@
           <w:rFonts w:ascii="宋体" w:hAnsi="宋体" w:eastAsia="宋体"/>
           <w:color w:val="000000"/>
         </w:rPr>
-        <w:t xml:space="preserve">小组成员：zyj、cyy、zdh、zy</w:t>
+        <w:t xml:space="preserve">小组成员：zyj、cyy、zdh、zy。</w:t>
       </w:r>
     </w:p>
     <w:p>
@@ -1062,7 +1132,7 @@
           <w:rFonts w:ascii="宋体" w:hAnsi="宋体" w:eastAsia="宋体"/>
           <w:color w:val="000000"/>
         </w:rPr>
-        <w:t xml:space="preserve">汇报重点：数据理解、特征分析、工程实现、复现实验、测试验收。</w:t>
+        <w:t xml:space="preserve">汇报重点：数据理解、特征分析、工程实现、论文复现、测试验收。</w:t>
       </w:r>
     </w:p>
     <w:p>
@@ -1081,6 +1151,24 @@
           <w:color w:val="000000"/>
         </w:rPr>
         <w:t xml:space="preserve">已交付内容：两个数据集 loader、特征工程、RUL 标签、模型训练、评价指标、notebook 示例、结题文档。</w:t>
+      </w:r>
+    </w:p>
+    <w:p>
+      <w:pPr>
+        <w:numPr>
+          <w:ilvl w:val="0"/>
+          <w:numId w:val="1002"/>
+        </w:numPr>
+        <w:pStyle w:val="Compact"/>
+        <w:spacing w:line="276" w:lineRule="auto" w:after="0"/>
+        <w:ind w:firstLine="420"/>
+      </w:pPr>
+      <w:r>
+        <w:rPr>
+          <w:rFonts w:ascii="宋体" w:hAnsi="宋体" w:eastAsia="宋体"/>
+          <w:color w:val="000000"/>
+        </w:rPr>
+        <w:t xml:space="preserve">口径提醒：先讲业务问题和数据语义，再讲模型和指标。</w:t>
       </w:r>
     </w:p>
     <w:bookmarkEnd w:id="23"/>
@@ -1148,7 +1236,7 @@
           <w:rFonts w:ascii="宋体" w:hAnsi="宋体" w:eastAsia="宋体"/>
           <w:color w:val="000000"/>
         </w:rPr>
-        <w:t xml:space="preserve">本次答辩主线是 RUL 回归预测，不展开离散状态分类。</w:t>
+        <w:t xml:space="preserve">本次答辩主线是 RUL 回归预测，不展开离散状态识别任务。</w:t>
       </w:r>
     </w:p>
     <w:bookmarkEnd w:id="24"/>
@@ -1180,7 +1268,7 @@
           <w:rFonts w:ascii="宋体" w:hAnsi="宋体" w:eastAsia="宋体"/>
           <w:color w:val="000000"/>
         </w:rPr>
-        <w:t xml:space="preserve">XJTU-SY：25.6 kHz、32768 点快照、1.28 s 快照时长、1 min 间隔、三工况十五轴承。</w:t>
+        <w:t xml:space="preserve">XJTU-SY：25.6 kHz、32768 点快照、1.28 s 快照时长、约 1 min 间隔、三工况十五轴承。</w:t>
       </w:r>
     </w:p>
     <w:p>
@@ -1234,7 +1322,7 @@
           <w:rFonts w:ascii="宋体" w:hAnsi="宋体" w:eastAsia="宋体"/>
           <w:color w:val="000000"/>
         </w:rPr>
-        <w:t xml:space="preserve">PHM2012 Test_set 的终止 RUL 按官方条目补充。</w:t>
+        <w:t xml:space="preserve">PHM2012 Test_set 的终止 RUL 按官方条目补充，不能只按本地文件数推断。</w:t>
       </w:r>
     </w:p>
     <w:bookmarkEnd w:id="25"/>
@@ -1302,7 +1390,7 @@
           <w:rFonts w:ascii="宋体" w:hAnsi="宋体" w:eastAsia="宋体"/>
           <w:color w:val="000000"/>
         </w:rPr>
-        <w:t xml:space="preserve">RMS 从约 0.56 上升到约 7.27，峰值和健康指标在后期也明显抬升。</w:t>
+        <w:t xml:space="preserve">RMS 从约 0.56 上升到约 7.27，峰值和健康指标在后期明显抬升。</w:t>
       </w:r>
     </w:p>
     <w:p>
@@ -1424,29 +1512,11 @@
           <w:rFonts w:ascii="宋体" w:hAnsi="宋体" w:eastAsia="宋体"/>
           <w:color w:val="000000"/>
         </w:rPr>
-        <w:t xml:space="preserve">健康指标同样由强度、冲击和频谱相关特征合成。</w:t>
-      </w:r>
-    </w:p>
-    <w:p>
-      <w:pPr>
-        <w:numPr>
-          <w:ilvl w:val="0"/>
-          <w:numId w:val="1006"/>
-        </w:numPr>
-        <w:pStyle w:val="Compact"/>
-        <w:spacing w:line="276" w:lineRule="auto" w:after="0"/>
-        <w:ind w:firstLine="420"/>
-      </w:pPr>
-      <w:r>
-        <w:rPr>
-          <w:rFonts w:ascii="宋体" w:hAnsi="宋体" w:eastAsia="宋体"/>
-          <w:color w:val="000000"/>
-        </w:rPr>
         <w:t xml:space="preserve">PHM2012 的快照更短、文件更密，并包含温度数据；本次主线先使用振动特征。</w:t>
       </w:r>
     </w:p>
     <w:bookmarkEnd w:id="27"/>
-    <w:bookmarkStart w:id="28" w:name="特征工程与-rul-标签构造"/>
+    <w:bookmarkStart w:id="28" w:name="多轴承特征摘要"/>
     <w:p>
       <w:pPr>
         <w:pStyle w:val="Heading2"/>
@@ -1456,7 +1526,7 @@
           <w:rFonts w:ascii="宋体" w:hAnsi="宋体" w:eastAsia="宋体"/>
           <w:color w:val="000000"/>
         </w:rPr>
-        <w:t xml:space="preserve">7. 特征工程与 RUL 标签构造</w:t>
+        <w:t xml:space="preserve">7. 多轴承特征摘要</w:t>
       </w:r>
     </w:p>
     <w:p>
@@ -1474,6 +1544,92 @@
           <w:rFonts w:ascii="宋体" w:hAnsi="宋体" w:eastAsia="宋体"/>
           <w:color w:val="000000"/>
         </w:rPr>
+        <w:t xml:space="preserve">新增多轴承统计图，覆盖 XJTU-SY 与 PHM2012 的多个代表轴承。</w:t>
+      </w:r>
+    </w:p>
+    <w:p>
+      <w:pPr>
+        <w:numPr>
+          <w:ilvl w:val="0"/>
+          <w:numId w:val="1007"/>
+        </w:numPr>
+        <w:pStyle w:val="Compact"/>
+        <w:spacing w:line="276" w:lineRule="auto" w:after="0"/>
+        <w:ind w:firstLine="420"/>
+      </w:pPr>
+      <w:r>
+        <w:rPr>
+          <w:rFonts w:ascii="宋体" w:hAnsi="宋体" w:eastAsia="宋体"/>
+          <w:color w:val="000000"/>
+        </w:rPr>
+        <w:t xml:space="preserve">XJTU-SY 四个代表轴承后期 RMS 均高于早期，放大倍数约 4.47 到 6.61。</w:t>
+      </w:r>
+    </w:p>
+    <w:p>
+      <w:pPr>
+        <w:numPr>
+          <w:ilvl w:val="0"/>
+          <w:numId w:val="1007"/>
+        </w:numPr>
+        <w:pStyle w:val="Compact"/>
+        <w:spacing w:line="276" w:lineRule="auto" w:after="0"/>
+        <w:ind w:firstLine="420"/>
+      </w:pPr>
+      <w:r>
+        <w:rPr>
+          <w:rFonts w:ascii="宋体" w:hAnsi="宋体" w:eastAsia="宋体"/>
+          <w:color w:val="000000"/>
+        </w:rPr>
+        <w:t xml:space="preserve">PHM2012 内部差异更明显，短序列不一定呈现单调退化。</w:t>
+      </w:r>
+    </w:p>
+    <w:p>
+      <w:pPr>
+        <w:numPr>
+          <w:ilvl w:val="0"/>
+          <w:numId w:val="1007"/>
+        </w:numPr>
+        <w:pStyle w:val="Compact"/>
+        <w:spacing w:line="276" w:lineRule="auto" w:after="0"/>
+        <w:ind w:firstLine="420"/>
+      </w:pPr>
+      <w:r>
+        <w:rPr>
+          <w:rFonts w:ascii="宋体" w:hAnsi="宋体" w:eastAsia="宋体"/>
+          <w:color w:val="000000"/>
+        </w:rPr>
+        <w:t xml:space="preserve">结论：代表曲线只说明局部现象，多轴承摘要用于补充统计视角。</w:t>
+      </w:r>
+    </w:p>
+    <w:bookmarkEnd w:id="28"/>
+    <w:bookmarkStart w:id="29" w:name="特征工程与-rul-标签构造"/>
+    <w:p>
+      <w:pPr>
+        <w:pStyle w:val="Heading2"/>
+      </w:pPr>
+      <w:r>
+        <w:rPr>
+          <w:rFonts w:ascii="宋体" w:hAnsi="宋体" w:eastAsia="宋体"/>
+          <w:color w:val="000000"/>
+        </w:rPr>
+        <w:t xml:space="preserve">8. 特征工程与 RUL 标签构造</w:t>
+      </w:r>
+    </w:p>
+    <w:p>
+      <w:pPr>
+        <w:numPr>
+          <w:ilvl w:val="0"/>
+          <w:numId w:val="1008"/>
+        </w:numPr>
+        <w:pStyle w:val="Compact"/>
+        <w:spacing w:line="276" w:lineRule="auto" w:after="0"/>
+        <w:ind w:firstLine="420"/>
+      </w:pPr>
+      <w:r>
+        <w:rPr>
+          <w:rFonts w:ascii="宋体" w:hAnsi="宋体" w:eastAsia="宋体"/>
+          <w:color w:val="000000"/>
+        </w:rPr>
         <w:t xml:space="preserve">默认提取 14 个时域特征和 5 个频域特征，共 19 维。</w:t>
       </w:r>
     </w:p>
@@ -1481,7 +1637,7 @@
       <w:pPr>
         <w:numPr>
           <w:ilvl w:val="0"/>
-          <w:numId w:val="1007"/>
+          <w:numId w:val="1008"/>
         </w:numPr>
         <w:pStyle w:val="Compact"/>
         <w:spacing w:line="276" w:lineRule="auto" w:after="0"/>
@@ -1499,7 +1655,7 @@
       <w:pPr>
         <w:numPr>
           <w:ilvl w:val="0"/>
-          <w:numId w:val="1007"/>
+          <w:numId w:val="1008"/>
         </w:numPr>
         <w:pStyle w:val="Compact"/>
         <w:spacing w:line="276" w:lineRule="auto" w:after="0"/>
@@ -1517,25 +1673,25 @@
       <w:pPr>
         <w:numPr>
           <w:ilvl w:val="0"/>
-          <w:numId w:val="1007"/>
-        </w:numPr>
-        <w:pStyle w:val="Compact"/>
-        <w:spacing w:line="276" w:lineRule="auto" w:after="0"/>
-        <w:ind w:firstLine="420"/>
-      </w:pPr>
-      <w:r>
-        <w:rPr>
-          <w:rFonts w:ascii="宋体" w:hAnsi="宋体" w:eastAsia="宋体"/>
-          <w:color w:val="000000"/>
-        </w:rPr>
-        <w:t xml:space="preserve">稳定性和频谱特征：均值、方差、主频、谱质心、谱熵。</w:t>
-      </w:r>
-    </w:p>
-    <w:p>
-      <w:pPr>
-        <w:numPr>
-          <w:ilvl w:val="0"/>
-          <w:numId w:val="1007"/>
+          <w:numId w:val="1008"/>
+        </w:numPr>
+        <w:pStyle w:val="Compact"/>
+        <w:spacing w:line="276" w:lineRule="auto" w:after="0"/>
+        <w:ind w:firstLine="420"/>
+      </w:pPr>
+      <w:r>
+        <w:rPr>
+          <w:rFonts w:ascii="宋体" w:hAnsi="宋体" w:eastAsia="宋体"/>
+          <w:color w:val="000000"/>
+        </w:rPr>
+        <w:t xml:space="preserve">频谱特征：主频、谱质心、谱熵。</w:t>
+      </w:r>
+    </w:p>
+    <w:p>
+      <w:pPr>
+        <w:numPr>
+          <w:ilvl w:val="0"/>
+          <w:numId w:val="1008"/>
         </w:numPr>
         <w:pStyle w:val="Compact"/>
         <w:spacing w:line="276" w:lineRule="auto" w:after="0"/>
@@ -1553,7 +1709,7 @@
       <w:pPr>
         <w:numPr>
           <w:ilvl w:val="0"/>
-          <w:numId w:val="1007"/>
+          <w:numId w:val="1008"/>
         </w:numPr>
         <w:pStyle w:val="Compact"/>
         <w:spacing w:line="276" w:lineRule="auto" w:after="0"/>
@@ -1593,25 +1749,187 @@
           <w:rFonts w:ascii="宋体" w:hAnsi="宋体" w:eastAsia="宋体"/>
           <w:color w:val="000000"/>
         </w:rPr>
-        <w:t xml:space="preserve">生成；如果只使用快照序号，则必须标注为 snapshot-level RUL，不能直接写成秒。</w:t>
-      </w:r>
-    </w:p>
-    <w:p>
-      <w:pPr>
-        <w:numPr>
-          <w:ilvl w:val="0"/>
-          <w:numId w:val="1007"/>
-        </w:numPr>
-        <w:pStyle w:val="Compact"/>
-        <w:spacing w:line="276" w:lineRule="auto" w:after="0"/>
-        <w:ind w:firstLine="420"/>
-      </w:pPr>
-      <w:r>
-        <w:rPr>
-          <w:rFonts w:ascii="宋体" w:hAnsi="宋体" w:eastAsia="宋体"/>
-          <w:color w:val="000000"/>
-        </w:rPr>
-        <w:t xml:space="preserve">XJTU-SY 示例：第</w:t>
+        <w:t xml:space="preserve">生成；若只用快照序号，则标注为 snapshot-level RUL。</w:t>
+      </w:r>
+    </w:p>
+    <w:bookmarkEnd w:id="29"/>
+    <w:bookmarkStart w:id="30" w:name="系统总体架构"/>
+    <w:p>
+      <w:pPr>
+        <w:pStyle w:val="Heading2"/>
+      </w:pPr>
+      <w:r>
+        <w:rPr>
+          <w:rFonts w:ascii="宋体" w:hAnsi="宋体" w:eastAsia="宋体"/>
+          <w:color w:val="000000"/>
+        </w:rPr>
+        <w:t xml:space="preserve">9. 系统总体架构</w:t>
+      </w:r>
+    </w:p>
+    <w:p>
+      <w:pPr>
+        <w:numPr>
+          <w:ilvl w:val="0"/>
+          <w:numId w:val="1009"/>
+        </w:numPr>
+        <w:pStyle w:val="Compact"/>
+        <w:spacing w:line="276" w:lineRule="auto" w:after="0"/>
+        <w:ind w:firstLine="420"/>
+      </w:pPr>
+      <w:r>
+        <w:rPr>
+          <w:rFonts w:ascii="宋体" w:hAnsi="宋体" w:eastAsia="宋体"/>
+          <w:color w:val="000000"/>
+        </w:rPr>
+        <w:t xml:space="preserve">数据接入层：读取 XJTU-SY 与 PHM2012，整理工况、采样率、通道和时间顺序。</w:t>
+      </w:r>
+    </w:p>
+    <w:p>
+      <w:pPr>
+        <w:numPr>
+          <w:ilvl w:val="0"/>
+          <w:numId w:val="1009"/>
+        </w:numPr>
+        <w:pStyle w:val="Compact"/>
+        <w:spacing w:line="276" w:lineRule="auto" w:after="0"/>
+        <w:ind w:firstLine="420"/>
+      </w:pPr>
+      <w:r>
+        <w:rPr>
+          <w:rFonts w:ascii="宋体" w:hAnsi="宋体" w:eastAsia="宋体"/>
+          <w:color w:val="000000"/>
+        </w:rPr>
+        <w:t xml:space="preserve">特征与标签层：提取 19 维时频域特征，构造特征序列和 RUL 标签。</w:t>
+      </w:r>
+    </w:p>
+    <w:p>
+      <w:pPr>
+        <w:numPr>
+          <w:ilvl w:val="0"/>
+          <w:numId w:val="1009"/>
+        </w:numPr>
+        <w:pStyle w:val="Compact"/>
+        <w:spacing w:line="276" w:lineRule="auto" w:after="0"/>
+        <w:ind w:firstLine="420"/>
+      </w:pPr>
+      <w:r>
+        <w:rPr>
+          <w:rFonts w:ascii="宋体" w:hAnsi="宋体" w:eastAsia="宋体"/>
+          <w:color w:val="000000"/>
+        </w:rPr>
+        <w:t xml:space="preserve">模型训练层：训练 baseline、CNN-LSTM-AM、xLSTM-Transformer，并保存训练记录。</w:t>
+      </w:r>
+    </w:p>
+    <w:p>
+      <w:pPr>
+        <w:numPr>
+          <w:ilvl w:val="0"/>
+          <w:numId w:val="1009"/>
+        </w:numPr>
+        <w:pStyle w:val="Compact"/>
+        <w:spacing w:line="276" w:lineRule="auto" w:after="0"/>
+        <w:ind w:firstLine="420"/>
+      </w:pPr>
+      <w:r>
+        <w:rPr>
+          <w:rFonts w:ascii="宋体" w:hAnsi="宋体" w:eastAsia="宋体"/>
+          <w:color w:val="000000"/>
+        </w:rPr>
+        <w:t xml:space="preserve">评价与展示层：输出误差指标、RUL 曲线、预测文件和复现实验对比表。</w:t>
+      </w:r>
+    </w:p>
+    <w:p>
+      <w:pPr>
+        <w:numPr>
+          <w:ilvl w:val="0"/>
+          <w:numId w:val="1009"/>
+        </w:numPr>
+        <w:pStyle w:val="Compact"/>
+        <w:spacing w:line="276" w:lineRule="auto" w:after="0"/>
+        <w:ind w:firstLine="420"/>
+      </w:pPr>
+      <w:r>
+        <w:rPr>
+          <w:rFonts w:ascii="宋体" w:hAnsi="宋体" w:eastAsia="宋体"/>
+          <w:color w:val="000000"/>
+        </w:rPr>
+        <w:t xml:space="preserve">边界原则：数据读取、特征构造、模型训练和评价输出分开实现。</w:t>
+      </w:r>
+    </w:p>
+    <w:bookmarkEnd w:id="30"/>
+    <w:bookmarkStart w:id="31" w:name="难点一异构数据集统一"/>
+    <w:p>
+      <w:pPr>
+        <w:pStyle w:val="Heading2"/>
+      </w:pPr>
+      <w:r>
+        <w:rPr>
+          <w:rFonts w:ascii="宋体" w:hAnsi="宋体" w:eastAsia="宋体"/>
+          <w:color w:val="000000"/>
+        </w:rPr>
+        <w:t xml:space="preserve">10. 难点一：异构数据集统一</w:t>
+      </w:r>
+    </w:p>
+    <w:p>
+      <w:pPr>
+        <w:numPr>
+          <w:ilvl w:val="0"/>
+          <w:numId w:val="1010"/>
+        </w:numPr>
+        <w:pStyle w:val="Compact"/>
+        <w:spacing w:line="276" w:lineRule="auto" w:after="0"/>
+        <w:ind w:firstLine="420"/>
+      </w:pPr>
+      <w:r>
+        <w:rPr>
+          <w:rFonts w:ascii="宋体" w:hAnsi="宋体" w:eastAsia="宋体"/>
+          <w:color w:val="000000"/>
+        </w:rPr>
+        <w:t xml:space="preserve">数据差异：快照长度、时间间隔、split 语义、终止 RUL 信息不同。</w:t>
+      </w:r>
+    </w:p>
+    <w:p>
+      <w:pPr>
+        <w:numPr>
+          <w:ilvl w:val="0"/>
+          <w:numId w:val="1010"/>
+        </w:numPr>
+        <w:pStyle w:val="Compact"/>
+        <w:spacing w:line="276" w:lineRule="auto" w:after="0"/>
+        <w:ind w:firstLine="420"/>
+      </w:pPr>
+      <w:r>
+        <w:rPr>
+          <w:rFonts w:ascii="宋体" w:hAnsi="宋体" w:eastAsia="宋体"/>
+          <w:color w:val="000000"/>
+        </w:rPr>
+        <w:t xml:space="preserve">解决原则：loader 只负责读取和整理数据，模型只接收统一后的特征序列。</w:t>
+      </w:r>
+    </w:p>
+    <w:p>
+      <w:pPr>
+        <w:numPr>
+          <w:ilvl w:val="0"/>
+          <w:numId w:val="1010"/>
+        </w:numPr>
+        <w:pStyle w:val="Compact"/>
+        <w:spacing w:line="276" w:lineRule="auto" w:after="0"/>
+        <w:ind w:firstLine="420"/>
+      </w:pPr>
+      <w:r>
+        <w:rPr>
+          <w:rFonts w:ascii="宋体" w:hAnsi="宋体" w:eastAsia="宋体"/>
+          <w:color w:val="000000"/>
+        </w:rPr>
+        <w:t xml:space="preserve">工程权衡：</w:t>
+      </w:r>
+      <w:r>
+        <w:rPr>
+          <w:rStyle w:val="VerbatimChar"/>
+          <w:rFonts w:ascii="宋体" w:hAnsi="宋体" w:eastAsia="宋体"/>
+          <w:color w:val="000000"/>
+        </w:rPr>
+        <w:t xml:space="preserve">max_samples</w:t>
       </w:r>
       <w:r>
         <w:rPr>
@@ -1622,11 +1940,193 @@
       </w:r>
       <w:r>
         <w:rPr>
+          <w:rFonts w:ascii="宋体" w:hAnsi="宋体" w:eastAsia="宋体"/>
+          <w:color w:val="000000"/>
+        </w:rPr>
+        <w:t xml:space="preserve">是读前均匀抽样，用于控制训练时间，同时保留早期、中期和后期片段。</w:t>
+      </w:r>
+    </w:p>
+    <w:bookmarkEnd w:id="31"/>
+    <w:bookmarkStart w:id="32" w:name="难点二信号到序列特征"/>
+    <w:p>
+      <w:pPr>
+        <w:pStyle w:val="Heading2"/>
+      </w:pPr>
+      <w:r>
+        <w:rPr>
+          <w:rFonts w:ascii="宋体" w:hAnsi="宋体" w:eastAsia="宋体"/>
+          <w:color w:val="000000"/>
+        </w:rPr>
+        <w:t xml:space="preserve">11. 难点二：信号到序列特征</w:t>
+      </w:r>
+    </w:p>
+    <w:p>
+      <w:pPr>
+        <w:numPr>
+          <w:ilvl w:val="0"/>
+          <w:numId w:val="1011"/>
+        </w:numPr>
+        <w:pStyle w:val="Compact"/>
+        <w:spacing w:line="276" w:lineRule="auto" w:after="0"/>
+        <w:ind w:firstLine="420"/>
+      </w:pPr>
+      <w:r>
+        <w:rPr>
+          <w:rFonts w:ascii="宋体" w:hAnsi="宋体" w:eastAsia="宋体"/>
+          <w:color w:val="000000"/>
+        </w:rPr>
+        <w:t xml:space="preserve">原始振动快照较长，不适合直接在课程范围内做稳定复现。</w:t>
+      </w:r>
+    </w:p>
+    <w:p>
+      <w:pPr>
+        <w:numPr>
+          <w:ilvl w:val="0"/>
+          <w:numId w:val="1011"/>
+        </w:numPr>
+        <w:pStyle w:val="Compact"/>
+        <w:spacing w:line="276" w:lineRule="auto" w:after="0"/>
+        <w:ind w:firstLine="420"/>
+      </w:pPr>
+      <w:r>
+        <w:rPr>
+          <w:rFonts w:ascii="宋体" w:hAnsi="宋体" w:eastAsia="宋体"/>
+          <w:color w:val="000000"/>
+        </w:rPr>
+        <w:t xml:space="preserve">处理流程：raw snapshot → 19 维 feature vector → feature sequence → RUL label → prediction。</w:t>
+      </w:r>
+    </w:p>
+    <w:p>
+      <w:pPr>
+        <w:numPr>
+          <w:ilvl w:val="0"/>
+          <w:numId w:val="1011"/>
+        </w:numPr>
+        <w:pStyle w:val="Compact"/>
+        <w:spacing w:line="276" w:lineRule="auto" w:after="0"/>
+        <w:ind w:firstLine="420"/>
+      </w:pPr>
+      <w:r>
+        <w:rPr>
+          <w:rFonts w:ascii="宋体" w:hAnsi="宋体" w:eastAsia="宋体"/>
+          <w:color w:val="000000"/>
+        </w:rPr>
+        <w:t xml:space="preserve">模型看到的是一段连续变化，而不是孤立的一个点。</w:t>
+      </w:r>
+    </w:p>
+    <w:bookmarkEnd w:id="32"/>
+    <w:bookmarkStart w:id="33" w:name="为什么选这两篇论文"/>
+    <w:p>
+      <w:pPr>
+        <w:pStyle w:val="Heading2"/>
+      </w:pPr>
+      <w:r>
+        <w:rPr>
+          <w:rFonts w:ascii="宋体" w:hAnsi="宋体" w:eastAsia="宋体"/>
+          <w:color w:val="000000"/>
+        </w:rPr>
+        <w:t xml:space="preserve">12. 为什么选这两篇论文</w:t>
+      </w:r>
+    </w:p>
+    <w:p>
+      <w:pPr>
+        <w:numPr>
+          <w:ilvl w:val="0"/>
+          <w:numId w:val="1012"/>
+        </w:numPr>
+        <w:pStyle w:val="Compact"/>
+        <w:spacing w:line="276" w:lineRule="auto" w:after="0"/>
+        <w:ind w:firstLine="420"/>
+      </w:pPr>
+      <w:r>
+        <w:rPr>
+          <w:rFonts w:ascii="宋体" w:hAnsi="宋体" w:eastAsia="宋体"/>
+          <w:color w:val="000000"/>
+        </w:rPr>
+        <w:t xml:space="preserve">Huang 等 2024 CNN-LSTM-AM：使用时域和频域特征，模型结构清晰，给出 Score 公式，适合验证 19 维特征、attention 模型和指标实现。</w:t>
+      </w:r>
+    </w:p>
+    <w:p>
+      <w:pPr>
+        <w:numPr>
+          <w:ilvl w:val="0"/>
+          <w:numId w:val="1012"/>
+        </w:numPr>
+        <w:pStyle w:val="Compact"/>
+        <w:spacing w:line="276" w:lineRule="auto" w:after="0"/>
+        <w:ind w:firstLine="420"/>
+      </w:pPr>
+      <w:r>
+        <w:rPr>
+          <w:rFonts w:ascii="宋体" w:hAnsi="宋体" w:eastAsia="宋体"/>
+          <w:color w:val="000000"/>
+        </w:rPr>
+        <w:t xml:space="preserve">Jiang 等 2026 xLSTM-Transformer：同时覆盖 XJTU-SY 与 PHM2012，公开工况划分、序列长度、训练参数和 RMSE/R2/Score，适合做第二篇同规格复现。</w:t>
+      </w:r>
+    </w:p>
+    <w:p>
+      <w:pPr>
+        <w:numPr>
+          <w:ilvl w:val="0"/>
+          <w:numId w:val="1012"/>
+        </w:numPr>
+        <w:pStyle w:val="Compact"/>
+        <w:spacing w:line="276" w:lineRule="auto" w:after="0"/>
+        <w:ind w:firstLine="420"/>
+      </w:pPr>
+      <w:r>
+        <w:rPr>
+          <w:rFonts w:ascii="宋体" w:hAnsi="宋体" w:eastAsia="宋体"/>
+          <w:color w:val="000000"/>
+        </w:rPr>
+        <w:t xml:space="preserve">选择依据：数据集匹配、结构可实现、baseline 可比较、指标可复查。</w:t>
+      </w:r>
+    </w:p>
+    <w:bookmarkEnd w:id="33"/>
+    <w:bookmarkStart w:id="34" w:name="复现实验怎么做"/>
+    <w:p>
+      <w:pPr>
+        <w:pStyle w:val="Heading2"/>
+      </w:pPr>
+      <w:r>
+        <w:rPr>
+          <w:rFonts w:ascii="宋体" w:hAnsi="宋体" w:eastAsia="宋体"/>
+          <w:color w:val="000000"/>
+        </w:rPr>
+        <w:t xml:space="preserve">13. 复现实验怎么做</w:t>
+      </w:r>
+    </w:p>
+    <w:p>
+      <w:pPr>
+        <w:numPr>
+          <w:ilvl w:val="0"/>
+          <w:numId w:val="1013"/>
+        </w:numPr>
+        <w:pStyle w:val="Compact"/>
+        <w:spacing w:line="276" w:lineRule="auto" w:after="0"/>
+        <w:ind w:firstLine="420"/>
+      </w:pPr>
+      <w:r>
+        <w:rPr>
+          <w:rFonts w:ascii="宋体" w:hAnsi="宋体" w:eastAsia="宋体"/>
+          <w:color w:val="000000"/>
+        </w:rPr>
+        <w:t xml:space="preserve">读取真实数据：优先从</w:t>
+      </w:r>
+      <w:r>
+        <w:rPr>
+          <w:rFonts w:ascii="宋体" w:hAnsi="宋体" w:eastAsia="宋体"/>
+          <w:color w:val="000000"/>
+        </w:rPr>
+        <w:t xml:space="preserve"> </w:t>
+      </w:r>
+      <w:r>
+        <w:rPr>
           <w:rStyle w:val="VerbatimChar"/>
           <w:rFonts w:ascii="宋体" w:hAnsi="宋体" w:eastAsia="宋体"/>
           <w:color w:val="000000"/>
         </w:rPr>
-        <w:t xml:space="preserve">i</w:t>
+        <w:t xml:space="preserve">data/external</w:t>
       </w:r>
       <w:r>
         <w:rPr>
@@ -1640,7 +2140,347 @@
           <w:rFonts w:ascii="宋体" w:hAnsi="宋体" w:eastAsia="宋体"/>
           <w:color w:val="000000"/>
         </w:rPr>
-        <w:t xml:space="preserve">个快照约对应</w:t>
+        <w:t xml:space="preserve">读取 XJTU-SY 与 PHM2012。</w:t>
+      </w:r>
+    </w:p>
+    <w:p>
+      <w:pPr>
+        <w:numPr>
+          <w:ilvl w:val="0"/>
+          <w:numId w:val="1013"/>
+        </w:numPr>
+        <w:pStyle w:val="Compact"/>
+        <w:spacing w:line="276" w:lineRule="auto" w:after="0"/>
+        <w:ind w:firstLine="420"/>
+      </w:pPr>
+      <w:r>
+        <w:rPr>
+          <w:rFonts w:ascii="宋体" w:hAnsi="宋体" w:eastAsia="宋体"/>
+          <w:color w:val="000000"/>
+        </w:rPr>
+        <w:t xml:space="preserve">构造特征序列：每个快照提取 19 维特征，再按时间顺序组成序列。</w:t>
+      </w:r>
+    </w:p>
+    <w:p>
+      <w:pPr>
+        <w:numPr>
+          <w:ilvl w:val="0"/>
+          <w:numId w:val="1013"/>
+        </w:numPr>
+        <w:pStyle w:val="Compact"/>
+        <w:spacing w:line="276" w:lineRule="auto" w:after="0"/>
+        <w:ind w:firstLine="420"/>
+      </w:pPr>
+      <w:r>
+        <w:rPr>
+          <w:rFonts w:ascii="宋体" w:hAnsi="宋体" w:eastAsia="宋体"/>
+          <w:color w:val="000000"/>
+        </w:rPr>
+        <w:t xml:space="preserve">训练主模型：CNN-LSTM-AM 与 XLSTM-Transformer 均真实训练 8 epoch。</w:t>
+      </w:r>
+    </w:p>
+    <w:p>
+      <w:pPr>
+        <w:numPr>
+          <w:ilvl w:val="0"/>
+          <w:numId w:val="1013"/>
+        </w:numPr>
+        <w:pStyle w:val="Compact"/>
+        <w:spacing w:line="276" w:lineRule="auto" w:after="0"/>
+        <w:ind w:firstLine="420"/>
+      </w:pPr>
+      <w:r>
+        <w:rPr>
+          <w:rFonts w:ascii="宋体" w:hAnsi="宋体" w:eastAsia="宋体"/>
+          <w:color w:val="000000"/>
+        </w:rPr>
+        <w:t xml:space="preserve">训练 baseline：CNN-LSTM、Feature-Transformer、LSTM-Transformer。</w:t>
+      </w:r>
+    </w:p>
+    <w:p>
+      <w:pPr>
+        <w:numPr>
+          <w:ilvl w:val="0"/>
+          <w:numId w:val="1013"/>
+        </w:numPr>
+        <w:pStyle w:val="Compact"/>
+        <w:spacing w:line="276" w:lineRule="auto" w:after="0"/>
+        <w:ind w:firstLine="420"/>
+      </w:pPr>
+      <w:r>
+        <w:rPr>
+          <w:rFonts w:ascii="宋体" w:hAnsi="宋体" w:eastAsia="宋体"/>
+          <w:color w:val="000000"/>
+        </w:rPr>
+        <w:t xml:space="preserve">输出指标：RMSE、NormalizedRMSE、R2、Huang Score、PHM Score。</w:t>
+      </w:r>
+    </w:p>
+    <w:p>
+      <w:pPr>
+        <w:numPr>
+          <w:ilvl w:val="0"/>
+          <w:numId w:val="1013"/>
+        </w:numPr>
+        <w:pStyle w:val="Compact"/>
+        <w:spacing w:line="276" w:lineRule="auto" w:after="0"/>
+        <w:ind w:firstLine="420"/>
+      </w:pPr>
+      <w:r>
+        <w:rPr>
+          <w:rFonts w:ascii="宋体" w:hAnsi="宋体" w:eastAsia="宋体"/>
+          <w:color w:val="000000"/>
+        </w:rPr>
+        <w:t xml:space="preserve">保存证据：</w:t>
+      </w:r>
+      <w:r>
+        <w:rPr>
+          <w:rStyle w:val="VerbatimChar"/>
+          <w:rFonts w:ascii="宋体" w:hAnsi="宋体" w:eastAsia="宋体"/>
+          <w:color w:val="000000"/>
+        </w:rPr>
+        <w:t xml:space="preserve">history.csv</w:t>
+      </w:r>
+      <w:r>
+        <w:rPr>
+          <w:rFonts w:ascii="宋体" w:hAnsi="宋体" w:eastAsia="宋体"/>
+          <w:color w:val="000000"/>
+        </w:rPr>
+        <w:t xml:space="preserve">、</w:t>
+      </w:r>
+      <w:r>
+        <w:rPr>
+          <w:rStyle w:val="VerbatimChar"/>
+          <w:rFonts w:ascii="宋体" w:hAnsi="宋体" w:eastAsia="宋体"/>
+          <w:color w:val="000000"/>
+        </w:rPr>
+        <w:t xml:space="preserve">metrics.json</w:t>
+      </w:r>
+      <w:r>
+        <w:rPr>
+          <w:rFonts w:ascii="宋体" w:hAnsi="宋体" w:eastAsia="宋体"/>
+          <w:color w:val="000000"/>
+        </w:rPr>
+        <w:t xml:space="preserve">、</w:t>
+      </w:r>
+      <w:r>
+        <w:rPr>
+          <w:rStyle w:val="VerbatimChar"/>
+          <w:rFonts w:ascii="宋体" w:hAnsi="宋体" w:eastAsia="宋体"/>
+          <w:color w:val="000000"/>
+        </w:rPr>
+        <w:t xml:space="preserve">predictions.csv</w:t>
+      </w:r>
+      <w:r>
+        <w:rPr>
+          <w:rFonts w:ascii="宋体" w:hAnsi="宋体" w:eastAsia="宋体"/>
+          <w:color w:val="000000"/>
+        </w:rPr>
+        <w:t xml:space="preserve">、</w:t>
+      </w:r>
+      <w:r>
+        <w:rPr>
+          <w:rStyle w:val="VerbatimChar"/>
+          <w:rFonts w:ascii="宋体" w:hAnsi="宋体" w:eastAsia="宋体"/>
+          <w:color w:val="000000"/>
+        </w:rPr>
+        <w:t xml:space="preserve">comparison_metrics.csv</w:t>
+      </w:r>
+      <w:r>
+        <w:rPr>
+          <w:rFonts w:ascii="宋体" w:hAnsi="宋体" w:eastAsia="宋体"/>
+          <w:color w:val="000000"/>
+        </w:rPr>
+        <w:t xml:space="preserve">。</w:t>
+      </w:r>
+    </w:p>
+    <w:bookmarkEnd w:id="34"/>
+    <w:bookmarkStart w:id="35" w:name="指标与结果边界"/>
+    <w:p>
+      <w:pPr>
+        <w:pStyle w:val="Heading2"/>
+      </w:pPr>
+      <w:r>
+        <w:rPr>
+          <w:rFonts w:ascii="宋体" w:hAnsi="宋体" w:eastAsia="宋体"/>
+          <w:color w:val="000000"/>
+        </w:rPr>
+        <w:t xml:space="preserve">14. 指标与结果边界</w:t>
+      </w:r>
+    </w:p>
+    <w:p>
+      <w:pPr>
+        <w:numPr>
+          <w:ilvl w:val="0"/>
+          <w:numId w:val="1014"/>
+        </w:numPr>
+        <w:pStyle w:val="Compact"/>
+        <w:spacing w:line="276" w:lineRule="auto" w:after="0"/>
+        <w:ind w:firstLine="420"/>
+      </w:pPr>
+      <w:r>
+        <w:rPr>
+          <w:rFonts w:ascii="宋体" w:hAnsi="宋体" w:eastAsia="宋体"/>
+          <w:color w:val="000000"/>
+        </w:rPr>
+        <w:t xml:space="preserve">普通回归误差：RMSE、MAE、SMAPE、R2。</w:t>
+      </w:r>
+    </w:p>
+    <w:p>
+      <w:pPr>
+        <w:numPr>
+          <w:ilvl w:val="0"/>
+          <w:numId w:val="1014"/>
+        </w:numPr>
+        <w:pStyle w:val="Compact"/>
+        <w:spacing w:line="276" w:lineRule="auto" w:after="0"/>
+        <w:ind w:firstLine="420"/>
+      </w:pPr>
+      <w:r>
+        <w:rPr>
+          <w:rFonts w:ascii="宋体" w:hAnsi="宋体" w:eastAsia="宋体"/>
+          <w:color w:val="000000"/>
+        </w:rPr>
+        <w:t xml:space="preserve">论文指标：Huang 原版 Score。</w:t>
+      </w:r>
+    </w:p>
+    <w:p>
+      <w:pPr>
+        <w:numPr>
+          <w:ilvl w:val="0"/>
+          <w:numId w:val="1014"/>
+        </w:numPr>
+        <w:pStyle w:val="Compact"/>
+        <w:spacing w:line="276" w:lineRule="auto" w:after="0"/>
+        <w:ind w:firstLine="420"/>
+      </w:pPr>
+      <w:r>
+        <w:rPr>
+          <w:rFonts w:ascii="宋体" w:hAnsi="宋体" w:eastAsia="宋体"/>
+          <w:color w:val="000000"/>
+        </w:rPr>
+        <w:t xml:space="preserve">挑战赛惩罚指标：PHM/RUL 惩罚 Score。</w:t>
+      </w:r>
+    </w:p>
+    <w:p>
+      <w:pPr>
+        <w:numPr>
+          <w:ilvl w:val="0"/>
+          <w:numId w:val="1014"/>
+        </w:numPr>
+        <w:pStyle w:val="Compact"/>
+        <w:spacing w:line="276" w:lineRule="auto" w:after="0"/>
+        <w:ind w:firstLine="420"/>
+      </w:pPr>
+      <w:r>
+        <w:rPr>
+          <w:rFonts w:ascii="宋体" w:hAnsi="宋体" w:eastAsia="宋体"/>
+          <w:color w:val="000000"/>
+        </w:rPr>
+        <w:t xml:space="preserve">方向倾向：over prediction rate、under prediction rate、within tolerance rate。</w:t>
+      </w:r>
+    </w:p>
+    <w:p>
+      <w:pPr>
+        <w:numPr>
+          <w:ilvl w:val="0"/>
+          <w:numId w:val="1014"/>
+        </w:numPr>
+        <w:pStyle w:val="Compact"/>
+        <w:spacing w:line="276" w:lineRule="auto" w:after="0"/>
+        <w:ind w:firstLine="420"/>
+      </w:pPr>
+      <w:r>
+        <w:rPr>
+          <w:rFonts w:ascii="宋体" w:hAnsi="宋体" w:eastAsia="宋体"/>
+          <w:color w:val="000000"/>
+        </w:rPr>
+        <w:t xml:space="preserve">结果口径：代表性数值来自真实数据 8 epoch 小规模训练，用于证明 workflow 和指标体系可复跑。</w:t>
+      </w:r>
+    </w:p>
+    <w:p>
+      <w:pPr>
+        <w:numPr>
+          <w:ilvl w:val="0"/>
+          <w:numId w:val="1014"/>
+        </w:numPr>
+        <w:pStyle w:val="Compact"/>
+        <w:spacing w:line="276" w:lineRule="auto" w:after="0"/>
+        <w:ind w:firstLine="420"/>
+      </w:pPr>
+      <w:r>
+        <w:rPr>
+          <w:rFonts w:ascii="宋体" w:hAnsi="宋体" w:eastAsia="宋体"/>
+          <w:color w:val="000000"/>
+        </w:rPr>
+        <w:t xml:space="preserve">边界说明：PHM2012 上负 R2 说明短训练拟合不足，报告中保留该限制，不把单次结果解释为最终性能结论。</w:t>
+      </w:r>
+    </w:p>
+    <w:bookmarkEnd w:id="35"/>
+    <w:bookmarkStart w:id="36" w:name="测试方案与验收证据"/>
+    <w:p>
+      <w:pPr>
+        <w:pStyle w:val="Heading2"/>
+      </w:pPr>
+      <w:r>
+        <w:rPr>
+          <w:rFonts w:ascii="宋体" w:hAnsi="宋体" w:eastAsia="宋体"/>
+          <w:color w:val="000000"/>
+        </w:rPr>
+        <w:t xml:space="preserve">15. 测试方案与验收证据</w:t>
+      </w:r>
+    </w:p>
+    <w:p>
+      <w:pPr>
+        <w:numPr>
+          <w:ilvl w:val="0"/>
+          <w:numId w:val="1015"/>
+        </w:numPr>
+        <w:pStyle w:val="Compact"/>
+        <w:spacing w:line="276" w:lineRule="auto" w:after="0"/>
+        <w:ind w:firstLine="420"/>
+      </w:pPr>
+      <w:r>
+        <w:rPr>
+          <w:rFonts w:ascii="宋体" w:hAnsi="宋体" w:eastAsia="宋体"/>
+          <w:color w:val="000000"/>
+        </w:rPr>
+        <w:t xml:space="preserve">全量 pytest：31 个测试通过。</w:t>
+      </w:r>
+    </w:p>
+    <w:p>
+      <w:pPr>
+        <w:numPr>
+          <w:ilvl w:val="0"/>
+          <w:numId w:val="1015"/>
+        </w:numPr>
+        <w:pStyle w:val="Compact"/>
+        <w:spacing w:line="276" w:lineRule="auto" w:after="0"/>
+        <w:ind w:firstLine="420"/>
+      </w:pPr>
+      <w:r>
+        <w:rPr>
+          <w:rFonts w:ascii="宋体" w:hAnsi="宋体" w:eastAsia="宋体"/>
+          <w:color w:val="000000"/>
+        </w:rPr>
+        <w:t xml:space="preserve">notebook：8 个示例 notebook 纳入执行验收。</w:t>
+      </w:r>
+    </w:p>
+    <w:p>
+      <w:pPr>
+        <w:numPr>
+          <w:ilvl w:val="0"/>
+          <w:numId w:val="1015"/>
+        </w:numPr>
+        <w:pStyle w:val="Compact"/>
+        <w:spacing w:line="276" w:lineRule="auto" w:after="0"/>
+        <w:ind w:firstLine="420"/>
+      </w:pPr>
+      <w:r>
+        <w:rPr>
+          <w:rFonts w:ascii="宋体" w:hAnsi="宋体" w:eastAsia="宋体"/>
+          <w:color w:val="000000"/>
+        </w:rPr>
+        <w:t xml:space="preserve">论文复现：两篇 workflow 均读取</w:t>
       </w:r>
       <w:r>
         <w:rPr>
@@ -1655,32 +2495,7 @@
           <w:rFonts w:ascii="宋体" w:hAnsi="宋体" w:eastAsia="宋体"/>
           <w:color w:val="000000"/>
         </w:rPr>
-        <w:t xml:space="preserve">i * 60s</w:t>
-      </w:r>
-      <w:r>
-        <w:rPr>
-          <w:rFonts w:ascii="宋体" w:hAnsi="宋体" w:eastAsia="宋体"/>
-          <w:color w:val="000000"/>
-        </w:rPr>
-        <w:t xml:space="preserve">，寿命终点为最后一个快照时间，因此剩余寿命可以解释为分钟级时间差。</w:t>
-      </w:r>
-    </w:p>
-    <w:p>
-      <w:pPr>
-        <w:numPr>
-          <w:ilvl w:val="0"/>
-          <w:numId w:val="1007"/>
-        </w:numPr>
-        <w:pStyle w:val="Compact"/>
-        <w:spacing w:line="276" w:lineRule="auto" w:after="0"/>
-        <w:ind w:firstLine="420"/>
-      </w:pPr>
-      <w:r>
-        <w:rPr>
-          <w:rFonts w:ascii="宋体" w:hAnsi="宋体" w:eastAsia="宋体"/>
-          <w:color w:val="000000"/>
-        </w:rPr>
-        <w:t xml:space="preserve">PHM2012 示例：Learning/Full_Test 可按约</w:t>
+        <w:t xml:space="preserve">data/external</w:t>
       </w:r>
       <w:r>
         <w:rPr>
@@ -1691,29 +2506,110 @@
       </w:r>
       <w:r>
         <w:rPr>
+          <w:rFonts w:ascii="宋体" w:hAnsi="宋体" w:eastAsia="宋体"/>
+          <w:color w:val="000000"/>
+        </w:rPr>
+        <w:t xml:space="preserve">真实数据。</w:t>
+      </w:r>
+    </w:p>
+    <w:p>
+      <w:pPr>
+        <w:numPr>
+          <w:ilvl w:val="0"/>
+          <w:numId w:val="1015"/>
+        </w:numPr>
+        <w:pStyle w:val="Compact"/>
+        <w:spacing w:line="276" w:lineRule="auto" w:after="0"/>
+        <w:ind w:firstLine="420"/>
+      </w:pPr>
+      <w:r>
+        <w:rPr>
+          <w:rFonts w:ascii="宋体" w:hAnsi="宋体" w:eastAsia="宋体"/>
+          <w:color w:val="000000"/>
+        </w:rPr>
+        <w:t xml:space="preserve">输出文件：</w:t>
+      </w:r>
+      <w:r>
+        <w:rPr>
           <w:rStyle w:val="VerbatimChar"/>
           <w:rFonts w:ascii="宋体" w:hAnsi="宋体" w:eastAsia="宋体"/>
           <w:color w:val="000000"/>
         </w:rPr>
-        <w:t xml:space="preserve">10s</w:t>
-      </w:r>
-      <w:r>
-        <w:rPr>
-          <w:rFonts w:ascii="宋体" w:hAnsi="宋体" w:eastAsia="宋体"/>
-          <w:color w:val="000000"/>
-        </w:rPr>
-        <w:t xml:space="preserve"> </w:t>
-      </w:r>
-      <w:r>
-        <w:rPr>
-          <w:rFonts w:ascii="宋体" w:hAnsi="宋体" w:eastAsia="宋体"/>
-          <w:color w:val="000000"/>
-        </w:rPr>
-        <w:t xml:space="preserve">文件间隔换算；Test_set 还要结合官方给出的终止 RUL 条目，不能只看本地文件数。</w:t>
-      </w:r>
-    </w:p>
-    <w:bookmarkEnd w:id="28"/>
-    <w:bookmarkStart w:id="29" w:name="系统总体架构"/>
+        <w:t xml:space="preserve">history.csv</w:t>
+      </w:r>
+      <w:r>
+        <w:rPr>
+          <w:rFonts w:ascii="宋体" w:hAnsi="宋体" w:eastAsia="宋体"/>
+          <w:color w:val="000000"/>
+        </w:rPr>
+        <w:t xml:space="preserve">、</w:t>
+      </w:r>
+      <w:r>
+        <w:rPr>
+          <w:rStyle w:val="VerbatimChar"/>
+          <w:rFonts w:ascii="宋体" w:hAnsi="宋体" w:eastAsia="宋体"/>
+          <w:color w:val="000000"/>
+        </w:rPr>
+        <w:t xml:space="preserve">metrics.json</w:t>
+      </w:r>
+      <w:r>
+        <w:rPr>
+          <w:rFonts w:ascii="宋体" w:hAnsi="宋体" w:eastAsia="宋体"/>
+          <w:color w:val="000000"/>
+        </w:rPr>
+        <w:t xml:space="preserve">、</w:t>
+      </w:r>
+      <w:r>
+        <w:rPr>
+          <w:rStyle w:val="VerbatimChar"/>
+          <w:rFonts w:ascii="宋体" w:hAnsi="宋体" w:eastAsia="宋体"/>
+          <w:color w:val="000000"/>
+        </w:rPr>
+        <w:t xml:space="preserve">predictions.csv</w:t>
+      </w:r>
+      <w:r>
+        <w:rPr>
+          <w:rFonts w:ascii="宋体" w:hAnsi="宋体" w:eastAsia="宋体"/>
+          <w:color w:val="000000"/>
+        </w:rPr>
+        <w:t xml:space="preserve">、</w:t>
+      </w:r>
+      <w:r>
+        <w:rPr>
+          <w:rStyle w:val="VerbatimChar"/>
+          <w:rFonts w:ascii="宋体" w:hAnsi="宋体" w:eastAsia="宋体"/>
+          <w:color w:val="000000"/>
+        </w:rPr>
+        <w:t xml:space="preserve">comparison_metrics.csv</w:t>
+      </w:r>
+      <w:r>
+        <w:rPr>
+          <w:rFonts w:ascii="宋体" w:hAnsi="宋体" w:eastAsia="宋体"/>
+          <w:color w:val="000000"/>
+        </w:rPr>
+        <w:t xml:space="preserve">。</w:t>
+      </w:r>
+    </w:p>
+    <w:p>
+      <w:pPr>
+        <w:numPr>
+          <w:ilvl w:val="0"/>
+          <w:numId w:val="1015"/>
+        </w:numPr>
+        <w:pStyle w:val="Compact"/>
+        <w:spacing w:line="276" w:lineRule="auto" w:after="0"/>
+        <w:ind w:firstLine="420"/>
+      </w:pPr>
+      <w:r>
+        <w:rPr>
+          <w:rFonts w:ascii="宋体" w:hAnsi="宋体" w:eastAsia="宋体"/>
+          <w:color w:val="000000"/>
+        </w:rPr>
+        <w:t xml:space="preserve">文档材料：结题报告、测试报告、用户手册、安装手册、技术论文、成员贡献说明、答辩提纲和讲稿。</w:t>
+      </w:r>
+    </w:p>
+    <w:bookmarkEnd w:id="36"/>
+    <w:bookmarkStart w:id="37" w:name="成员分工不足与总结"/>
     <w:p>
       <w:pPr>
         <w:pStyle w:val="Heading2"/>
@@ -1723,148 +2619,119 @@
           <w:rFonts w:ascii="宋体" w:hAnsi="宋体" w:eastAsia="宋体"/>
           <w:color w:val="000000"/>
         </w:rPr>
-        <w:t xml:space="preserve">8. 系统总体架构</w:t>
-      </w:r>
-    </w:p>
-    <w:p>
-      <w:pPr>
-        <w:numPr>
-          <w:ilvl w:val="0"/>
-          <w:numId w:val="1008"/>
-        </w:numPr>
-        <w:pStyle w:val="Compact"/>
-        <w:spacing w:line="276" w:lineRule="auto" w:after="0"/>
-        <w:ind w:firstLine="420"/>
-      </w:pPr>
-      <w:r>
-        <w:rPr>
-          <w:rFonts w:ascii="宋体" w:hAnsi="宋体" w:eastAsia="宋体"/>
-          <w:color w:val="000000"/>
-        </w:rPr>
-        <w:t xml:space="preserve">数据接入层：读取 XJTU-SY 与 PHM2012，整理工况、采样率、通道和时间顺序。</w:t>
-      </w:r>
-    </w:p>
-    <w:p>
-      <w:pPr>
-        <w:numPr>
-          <w:ilvl w:val="0"/>
-          <w:numId w:val="1008"/>
-        </w:numPr>
-        <w:pStyle w:val="Compact"/>
-        <w:spacing w:line="276" w:lineRule="auto" w:after="0"/>
-        <w:ind w:firstLine="420"/>
-      </w:pPr>
-      <w:r>
-        <w:rPr>
-          <w:rFonts w:ascii="宋体" w:hAnsi="宋体" w:eastAsia="宋体"/>
-          <w:color w:val="000000"/>
-        </w:rPr>
-        <w:t xml:space="preserve">特征与标签层：提取 19 维时频域特征，按数据集时间语义构造特征序列和 RUL 标签。</w:t>
-      </w:r>
-    </w:p>
-    <w:p>
-      <w:pPr>
-        <w:numPr>
-          <w:ilvl w:val="0"/>
-          <w:numId w:val="1008"/>
-        </w:numPr>
-        <w:pStyle w:val="Compact"/>
-        <w:spacing w:line="276" w:lineRule="auto" w:after="0"/>
-        <w:ind w:firstLine="420"/>
-      </w:pPr>
-      <w:r>
-        <w:rPr>
-          <w:rFonts w:ascii="宋体" w:hAnsi="宋体" w:eastAsia="宋体"/>
-          <w:color w:val="000000"/>
-        </w:rPr>
-        <w:t xml:space="preserve">模型训练层：训练 baseline、CNN-LSTM-AM、xLSTM-Transformer，并保存训练记录。</w:t>
-      </w:r>
-    </w:p>
-    <w:p>
-      <w:pPr>
-        <w:numPr>
-          <w:ilvl w:val="0"/>
-          <w:numId w:val="1008"/>
-        </w:numPr>
-        <w:pStyle w:val="Compact"/>
-        <w:spacing w:line="276" w:lineRule="auto" w:after="0"/>
-        <w:ind w:firstLine="420"/>
-      </w:pPr>
-      <w:r>
-        <w:rPr>
-          <w:rFonts w:ascii="宋体" w:hAnsi="宋体" w:eastAsia="宋体"/>
-          <w:color w:val="000000"/>
-        </w:rPr>
-        <w:t xml:space="preserve">评价与展示层：输出误差指标、RUL 曲线、预测文件和复现实验对比表。</w:t>
-      </w:r>
-    </w:p>
-    <w:p>
-      <w:pPr>
-        <w:numPr>
-          <w:ilvl w:val="0"/>
-          <w:numId w:val="1008"/>
-        </w:numPr>
-        <w:pStyle w:val="Compact"/>
-        <w:spacing w:line="276" w:lineRule="auto" w:after="0"/>
-        <w:ind w:firstLine="420"/>
-      </w:pPr>
-      <w:r>
-        <w:rPr>
-          <w:rFonts w:ascii="宋体" w:hAnsi="宋体" w:eastAsia="宋体"/>
-          <w:color w:val="000000"/>
-        </w:rPr>
-        <w:t xml:space="preserve">边界原则：数据读取、特征构造、模型训练和评价输出分开实现。</w:t>
-      </w:r>
-    </w:p>
-    <w:p>
-      <w:pPr>
-        <w:numPr>
-          <w:ilvl w:val="0"/>
-          <w:numId w:val="1008"/>
-        </w:numPr>
-        <w:pStyle w:val="Compact"/>
-        <w:spacing w:line="276" w:lineRule="auto" w:after="0"/>
-        <w:ind w:firstLine="420"/>
-      </w:pPr>
-      <w:r>
-        <w:rPr>
-          <w:rFonts w:ascii="宋体" w:hAnsi="宋体" w:eastAsia="宋体"/>
-          <w:color w:val="000000"/>
-        </w:rPr>
-        <w:t xml:space="preserve">展示入口：核心逻辑在</w:t>
-      </w:r>
-      <w:r>
-        <w:rPr>
-          <w:rFonts w:ascii="宋体" w:hAnsi="宋体" w:eastAsia="宋体"/>
-          <w:color w:val="000000"/>
-        </w:rPr>
-        <w:t xml:space="preserve"> </w:t>
-      </w:r>
-      <w:r>
-        <w:rPr>
-          <w:rStyle w:val="VerbatimChar"/>
-          <w:rFonts w:ascii="宋体" w:hAnsi="宋体" w:eastAsia="宋体"/>
-          <w:color w:val="000000"/>
-        </w:rPr>
-        <w:t xml:space="preserve">src</w:t>
-      </w:r>
-      <w:r>
-        <w:rPr>
-          <w:rFonts w:ascii="宋体" w:hAnsi="宋体" w:eastAsia="宋体"/>
-          <w:color w:val="000000"/>
-        </w:rPr>
-        <w:t xml:space="preserve"> </w:t>
-      </w:r>
-      <w:r>
-        <w:rPr>
-          <w:rFonts w:ascii="宋体" w:hAnsi="宋体" w:eastAsia="宋体"/>
-          <w:color w:val="000000"/>
-        </w:rPr>
-        <w:t xml:space="preserve">包内，notebook 主要用于示例运行和论文复现实验。</w:t>
-      </w:r>
-    </w:p>
-    <w:bookmarkEnd w:id="29"/>
-    <w:bookmarkStart w:id="30" w:name="难点一异构数据集统一"/>
+        <w:t xml:space="preserve">16. 成员分工、不足与总结</w:t>
+      </w:r>
+    </w:p>
+    <w:p>
+      <w:pPr>
+        <w:numPr>
+          <w:ilvl w:val="0"/>
+          <w:numId w:val="1016"/>
+        </w:numPr>
+        <w:pStyle w:val="Compact"/>
+        <w:spacing w:line="276" w:lineRule="auto" w:after="0"/>
+        <w:ind w:firstLine="420"/>
+      </w:pPr>
+      <w:r>
+        <w:rPr>
+          <w:rFonts w:ascii="宋体" w:hAnsi="宋体" w:eastAsia="宋体"/>
+          <w:color w:val="000000"/>
+        </w:rPr>
+        <w:t xml:space="preserve">zyj：系统架构、RUL 模型、训练 workflow 和论文复现，35%。</w:t>
+      </w:r>
+    </w:p>
+    <w:p>
+      <w:pPr>
+        <w:numPr>
+          <w:ilvl w:val="0"/>
+          <w:numId w:val="1016"/>
+        </w:numPr>
+        <w:pStyle w:val="Compact"/>
+        <w:spacing w:line="276" w:lineRule="auto" w:after="0"/>
+        <w:ind w:firstLine="420"/>
+      </w:pPr>
+      <w:r>
+        <w:rPr>
+          <w:rFonts w:ascii="宋体" w:hAnsi="宋体" w:eastAsia="宋体"/>
+          <w:color w:val="000000"/>
+        </w:rPr>
+        <w:t xml:space="preserve">cyy：数据处理、特征工程、loader 和数据文档，25%。</w:t>
+      </w:r>
+    </w:p>
+    <w:p>
+      <w:pPr>
+        <w:numPr>
+          <w:ilvl w:val="0"/>
+          <w:numId w:val="1016"/>
+        </w:numPr>
+        <w:pStyle w:val="Compact"/>
+        <w:spacing w:line="276" w:lineRule="auto" w:after="0"/>
+        <w:ind w:firstLine="420"/>
+      </w:pPr>
+      <w:r>
+        <w:rPr>
+          <w:rFonts w:ascii="宋体" w:hAnsi="宋体" w:eastAsia="宋体"/>
+          <w:color w:val="000000"/>
+        </w:rPr>
+        <w:t xml:space="preserve">zdh：概率分析基础能力、评价支持、测试报告，20%。</w:t>
+      </w:r>
+    </w:p>
+    <w:p>
+      <w:pPr>
+        <w:numPr>
+          <w:ilvl w:val="0"/>
+          <w:numId w:val="1016"/>
+        </w:numPr>
+        <w:pStyle w:val="Compact"/>
+        <w:spacing w:line="276" w:lineRule="auto" w:after="0"/>
+        <w:ind w:firstLine="420"/>
+      </w:pPr>
+      <w:r>
+        <w:rPr>
+          <w:rFonts w:ascii="宋体" w:hAnsi="宋体" w:eastAsia="宋体"/>
+          <w:color w:val="000000"/>
+        </w:rPr>
+        <w:t xml:space="preserve">zy：可视化、用户文档、答辩材料，20%。</w:t>
+      </w:r>
+    </w:p>
+    <w:p>
+      <w:pPr>
+        <w:numPr>
+          <w:ilvl w:val="0"/>
+          <w:numId w:val="1016"/>
+        </w:numPr>
+        <w:pStyle w:val="Compact"/>
+        <w:spacing w:line="276" w:lineRule="auto" w:after="0"/>
+        <w:ind w:firstLine="420"/>
+      </w:pPr>
+      <w:r>
+        <w:rPr>
+          <w:rFonts w:ascii="宋体" w:hAnsi="宋体" w:eastAsia="宋体"/>
+          <w:color w:val="000000"/>
+        </w:rPr>
+        <w:t xml:space="preserve">不足：训练规模较小，未做多随机种子和充分跨工况验证，温度信息尚未深入融合。</w:t>
+      </w:r>
+    </w:p>
+    <w:p>
+      <w:pPr>
+        <w:numPr>
+          <w:ilvl w:val="0"/>
+          <w:numId w:val="1016"/>
+        </w:numPr>
+        <w:pStyle w:val="Compact"/>
+        <w:spacing w:line="276" w:lineRule="auto" w:after="0"/>
+        <w:ind w:firstLine="420"/>
+      </w:pPr>
+      <w:r>
+        <w:rPr>
+          <w:rFonts w:ascii="宋体" w:hAnsi="宋体" w:eastAsia="宋体"/>
+          <w:color w:val="000000"/>
+        </w:rPr>
+        <w:t xml:space="preserve">总结：项目把真实数据读取、特征提取、RUL 建模、评价输出和课程文档交付实际跑通。</w:t>
+      </w:r>
+    </w:p>
+    <w:bookmarkEnd w:id="37"/>
+    <w:bookmarkStart w:id="38" w:name="汇报时间与语气控制"/>
     <w:p>
       <w:pPr>
         <w:pStyle w:val="Heading2"/>
@@ -1874,529 +2741,7 @@
           <w:rFonts w:ascii="宋体" w:hAnsi="宋体" w:eastAsia="宋体"/>
           <w:color w:val="000000"/>
         </w:rPr>
-        <w:t xml:space="preserve">9. 难点一：异构数据集统一</w:t>
-      </w:r>
-    </w:p>
-    <w:p>
-      <w:pPr>
-        <w:numPr>
-          <w:ilvl w:val="0"/>
-          <w:numId w:val="1009"/>
-        </w:numPr>
-        <w:pStyle w:val="Compact"/>
-        <w:spacing w:line="276" w:lineRule="auto" w:after="0"/>
-        <w:ind w:firstLine="420"/>
-      </w:pPr>
-      <w:r>
-        <w:rPr>
-          <w:rFonts w:ascii="宋体" w:hAnsi="宋体" w:eastAsia="宋体"/>
-          <w:color w:val="000000"/>
-        </w:rPr>
-        <w:t xml:space="preserve">数据差异：快照长度、时间间隔、split 语义、终止 RUL 信息不同。</w:t>
-      </w:r>
-    </w:p>
-    <w:p>
-      <w:pPr>
-        <w:numPr>
-          <w:ilvl w:val="0"/>
-          <w:numId w:val="1009"/>
-        </w:numPr>
-        <w:pStyle w:val="Compact"/>
-        <w:spacing w:line="276" w:lineRule="auto" w:after="0"/>
-        <w:ind w:firstLine="420"/>
-      </w:pPr>
-      <w:r>
-        <w:rPr>
-          <w:rFonts w:ascii="宋体" w:hAnsi="宋体" w:eastAsia="宋体"/>
-          <w:color w:val="000000"/>
-        </w:rPr>
-        <w:t xml:space="preserve">解决原则：loader 只负责读取和整理数据，模型只接收统一后的特征序列。</w:t>
-      </w:r>
-    </w:p>
-    <w:p>
-      <w:pPr>
-        <w:numPr>
-          <w:ilvl w:val="0"/>
-          <w:numId w:val="1009"/>
-        </w:numPr>
-        <w:pStyle w:val="Compact"/>
-        <w:spacing w:line="276" w:lineRule="auto" w:after="0"/>
-        <w:ind w:firstLine="420"/>
-      </w:pPr>
-      <w:r>
-        <w:rPr>
-          <w:rFonts w:ascii="宋体" w:hAnsi="宋体" w:eastAsia="宋体"/>
-          <w:color w:val="000000"/>
-        </w:rPr>
-        <w:t xml:space="preserve">工程权衡：</w:t>
-      </w:r>
-      <w:r>
-        <w:rPr>
-          <w:rStyle w:val="VerbatimChar"/>
-          <w:rFonts w:ascii="宋体" w:hAnsi="宋体" w:eastAsia="宋体"/>
-          <w:color w:val="000000"/>
-        </w:rPr>
-        <w:t xml:space="preserve">max_samples</w:t>
-      </w:r>
-      <w:r>
-        <w:rPr>
-          <w:rFonts w:ascii="宋体" w:hAnsi="宋体" w:eastAsia="宋体"/>
-          <w:color w:val="000000"/>
-        </w:rPr>
-        <w:t xml:space="preserve"> </w:t>
-      </w:r>
-      <w:r>
-        <w:rPr>
-          <w:rFonts w:ascii="宋体" w:hAnsi="宋体" w:eastAsia="宋体"/>
-          <w:color w:val="000000"/>
-        </w:rPr>
-        <w:t xml:space="preserve">是读前均匀抽样，用于控制训练时间，同时保留早期、中期和后期片段。</w:t>
-      </w:r>
-    </w:p>
-    <w:bookmarkEnd w:id="30"/>
-    <w:bookmarkStart w:id="31" w:name="难点二信号到序列特征"/>
-    <w:p>
-      <w:pPr>
-        <w:pStyle w:val="Heading2"/>
-      </w:pPr>
-      <w:r>
-        <w:rPr>
-          <w:rFonts w:ascii="宋体" w:hAnsi="宋体" w:eastAsia="宋体"/>
-          <w:color w:val="000000"/>
-        </w:rPr>
-        <w:t xml:space="preserve">10. 难点二：信号到序列特征</w:t>
-      </w:r>
-    </w:p>
-    <w:p>
-      <w:pPr>
-        <w:numPr>
-          <w:ilvl w:val="0"/>
-          <w:numId w:val="1010"/>
-        </w:numPr>
-        <w:pStyle w:val="Compact"/>
-        <w:spacing w:line="276" w:lineRule="auto" w:after="0"/>
-        <w:ind w:firstLine="420"/>
-      </w:pPr>
-      <w:r>
-        <w:rPr>
-          <w:rFonts w:ascii="宋体" w:hAnsi="宋体" w:eastAsia="宋体"/>
-          <w:color w:val="000000"/>
-        </w:rPr>
-        <w:t xml:space="preserve">原始振动快照较长，不适合直接在课程范围内做稳定复现。</w:t>
-      </w:r>
-    </w:p>
-    <w:p>
-      <w:pPr>
-        <w:numPr>
-          <w:ilvl w:val="0"/>
-          <w:numId w:val="1010"/>
-        </w:numPr>
-        <w:pStyle w:val="Compact"/>
-        <w:spacing w:line="276" w:lineRule="auto" w:after="0"/>
-        <w:ind w:firstLine="420"/>
-      </w:pPr>
-      <w:r>
-        <w:rPr>
-          <w:rFonts w:ascii="宋体" w:hAnsi="宋体" w:eastAsia="宋体"/>
-          <w:color w:val="000000"/>
-        </w:rPr>
-        <w:t xml:space="preserve">处理流程：raw snapshot → 19 维 feature vector → feature sequence → RUL label → prediction。</w:t>
-      </w:r>
-    </w:p>
-    <w:p>
-      <w:pPr>
-        <w:numPr>
-          <w:ilvl w:val="0"/>
-          <w:numId w:val="1010"/>
-        </w:numPr>
-        <w:pStyle w:val="Compact"/>
-        <w:spacing w:line="276" w:lineRule="auto" w:after="0"/>
-        <w:ind w:firstLine="420"/>
-      </w:pPr>
-      <w:r>
-        <w:rPr>
-          <w:rFonts w:ascii="宋体" w:hAnsi="宋体" w:eastAsia="宋体"/>
-          <w:color w:val="000000"/>
-        </w:rPr>
-        <w:t xml:space="preserve">模型看到的是一段连续变化，而不是孤立的一个点。</w:t>
-      </w:r>
-    </w:p>
-    <w:bookmarkEnd w:id="31"/>
-    <w:bookmarkStart w:id="32" w:name="rul-模型与复现实验设计"/>
-    <w:p>
-      <w:pPr>
-        <w:pStyle w:val="Heading2"/>
-      </w:pPr>
-      <w:r>
-        <w:rPr>
-          <w:rFonts w:ascii="宋体" w:hAnsi="宋体" w:eastAsia="宋体"/>
-          <w:color w:val="000000"/>
-        </w:rPr>
-        <w:t xml:space="preserve">11. RUL 模型与复现实验设计</w:t>
-      </w:r>
-    </w:p>
-    <w:p>
-      <w:pPr>
-        <w:numPr>
-          <w:ilvl w:val="0"/>
-          <w:numId w:val="1011"/>
-        </w:numPr>
-        <w:pStyle w:val="Compact"/>
-        <w:spacing w:line="276" w:lineRule="auto" w:after="0"/>
-        <w:ind w:firstLine="420"/>
-      </w:pPr>
-      <w:r>
-        <w:rPr>
-          <w:rFonts w:ascii="宋体" w:hAnsi="宋体" w:eastAsia="宋体"/>
-          <w:color w:val="000000"/>
-        </w:rPr>
-        <w:t xml:space="preserve">Huang 等 2024：CNN-LSTM-AM，CNN 提局部模式，LSTM 建模时间依赖，attention 聚合关键时间步。</w:t>
-      </w:r>
-    </w:p>
-    <w:p>
-      <w:pPr>
-        <w:numPr>
-          <w:ilvl w:val="0"/>
-          <w:numId w:val="1011"/>
-        </w:numPr>
-        <w:pStyle w:val="Compact"/>
-        <w:spacing w:line="276" w:lineRule="auto" w:after="0"/>
-        <w:ind w:firstLine="420"/>
-      </w:pPr>
-      <w:r>
-        <w:rPr>
-          <w:rFonts w:ascii="宋体" w:hAnsi="宋体" w:eastAsia="宋体"/>
-          <w:color w:val="000000"/>
-        </w:rPr>
-        <w:t xml:space="preserve">Jiang 等 2026：xLSTM-Transformer，参考论文结构实现并适配本项目特征序列输入。</w:t>
-      </w:r>
-    </w:p>
-    <w:p>
-      <w:pPr>
-        <w:numPr>
-          <w:ilvl w:val="0"/>
-          <w:numId w:val="1011"/>
-        </w:numPr>
-        <w:pStyle w:val="Compact"/>
-        <w:spacing w:line="276" w:lineRule="auto" w:after="0"/>
-        <w:ind w:firstLine="420"/>
-      </w:pPr>
-      <w:r>
-        <w:rPr>
-          <w:rFonts w:ascii="宋体" w:hAnsi="宋体" w:eastAsia="宋体"/>
-          <w:color w:val="000000"/>
-        </w:rPr>
-        <w:t xml:space="preserve">训练设置：真实数据小规模训练验收，8 epoch。</w:t>
-      </w:r>
-    </w:p>
-    <w:p>
-      <w:pPr>
-        <w:numPr>
-          <w:ilvl w:val="0"/>
-          <w:numId w:val="1011"/>
-        </w:numPr>
-        <w:pStyle w:val="Compact"/>
-        <w:spacing w:line="276" w:lineRule="auto" w:after="0"/>
-        <w:ind w:firstLine="420"/>
-      </w:pPr>
-      <w:r>
-        <w:rPr>
-          <w:rFonts w:ascii="宋体" w:hAnsi="宋体" w:eastAsia="宋体"/>
-          <w:color w:val="000000"/>
-        </w:rPr>
-        <w:t xml:space="preserve">复现边界：不把课程范围内结果说成论文完整数值对齐。</w:t>
-      </w:r>
-    </w:p>
-    <w:bookmarkEnd w:id="32"/>
-    <w:bookmarkStart w:id="33" w:name="评价指标与实验结果解释"/>
-    <w:p>
-      <w:pPr>
-        <w:pStyle w:val="Heading2"/>
-      </w:pPr>
-      <w:r>
-        <w:rPr>
-          <w:rFonts w:ascii="宋体" w:hAnsi="宋体" w:eastAsia="宋体"/>
-          <w:color w:val="000000"/>
-        </w:rPr>
-        <w:t xml:space="preserve">12. 评价指标与实验结果解释</w:t>
-      </w:r>
-    </w:p>
-    <w:p>
-      <w:pPr>
-        <w:numPr>
-          <w:ilvl w:val="0"/>
-          <w:numId w:val="1012"/>
-        </w:numPr>
-        <w:pStyle w:val="Compact"/>
-        <w:spacing w:line="276" w:lineRule="auto" w:after="0"/>
-        <w:ind w:firstLine="420"/>
-      </w:pPr>
-      <w:r>
-        <w:rPr>
-          <w:rFonts w:ascii="宋体" w:hAnsi="宋体" w:eastAsia="宋体"/>
-          <w:color w:val="000000"/>
-        </w:rPr>
-        <w:t xml:space="preserve">普通回归误差：RMSE、MAE、SMAPE、R2。</w:t>
-      </w:r>
-    </w:p>
-    <w:p>
-      <w:pPr>
-        <w:numPr>
-          <w:ilvl w:val="0"/>
-          <w:numId w:val="1012"/>
-        </w:numPr>
-        <w:pStyle w:val="Compact"/>
-        <w:spacing w:line="276" w:lineRule="auto" w:after="0"/>
-        <w:ind w:firstLine="420"/>
-      </w:pPr>
-      <w:r>
-        <w:rPr>
-          <w:rFonts w:ascii="宋体" w:hAnsi="宋体" w:eastAsia="宋体"/>
-          <w:color w:val="000000"/>
-        </w:rPr>
-        <w:t xml:space="preserve">RUL 任务指标：Huang 原版 Score、PHM/RUL 惩罚 Score。</w:t>
-      </w:r>
-    </w:p>
-    <w:p>
-      <w:pPr>
-        <w:numPr>
-          <w:ilvl w:val="0"/>
-          <w:numId w:val="1012"/>
-        </w:numPr>
-        <w:pStyle w:val="Compact"/>
-        <w:spacing w:line="276" w:lineRule="auto" w:after="0"/>
-        <w:ind w:firstLine="420"/>
-      </w:pPr>
-      <w:r>
-        <w:rPr>
-          <w:rFonts w:ascii="宋体" w:hAnsi="宋体" w:eastAsia="宋体"/>
-          <w:color w:val="000000"/>
-        </w:rPr>
-        <w:t xml:space="preserve">方向倾向：over prediction rate、under prediction rate、within tolerance rate。</w:t>
-      </w:r>
-    </w:p>
-    <w:p>
-      <w:pPr>
-        <w:numPr>
-          <w:ilvl w:val="0"/>
-          <w:numId w:val="1012"/>
-        </w:numPr>
-        <w:pStyle w:val="Compact"/>
-        <w:spacing w:line="276" w:lineRule="auto" w:after="0"/>
-        <w:ind w:firstLine="420"/>
-      </w:pPr>
-      <w:r>
-        <w:rPr>
-          <w:rFonts w:ascii="宋体" w:hAnsi="宋体" w:eastAsia="宋体"/>
-          <w:color w:val="000000"/>
-        </w:rPr>
-        <w:t xml:space="preserve">结果解释重点：误差大小、趋势是否合理、提前和滞后预测各有什么风险。</w:t>
-      </w:r>
-    </w:p>
-    <w:bookmarkEnd w:id="33"/>
-    <w:bookmarkStart w:id="35" w:name="测试方案与验收证据"/>
-    <w:p>
-      <w:pPr>
-        <w:pStyle w:val="Heading2"/>
-      </w:pPr>
-      <w:r>
-        <w:rPr>
-          <w:rFonts w:ascii="宋体" w:hAnsi="宋体" w:eastAsia="宋体"/>
-          <w:color w:val="000000"/>
-        </w:rPr>
-        <w:t xml:space="preserve">13. 测试方案与验收证据</w:t>
-      </w:r>
-    </w:p>
-    <w:p>
-      <w:pPr>
-        <w:numPr>
-          <w:ilvl w:val="0"/>
-          <w:numId w:val="1013"/>
-        </w:numPr>
-        <w:pStyle w:val="Compact"/>
-        <w:spacing w:line="276" w:lineRule="auto" w:after="0"/>
-        <w:ind w:firstLine="420"/>
-      </w:pPr>
-      <w:r>
-        <w:rPr>
-          <w:rFonts w:ascii="宋体" w:hAnsi="宋体" w:eastAsia="宋体"/>
-          <w:color w:val="000000"/>
-        </w:rPr>
-        <w:t xml:space="preserve">全量 pytest：31 个测试通过。</w:t>
-      </w:r>
-    </w:p>
-    <w:p>
-      <w:pPr>
-        <w:numPr>
-          <w:ilvl w:val="0"/>
-          <w:numId w:val="1013"/>
-        </w:numPr>
-        <w:pStyle w:val="Compact"/>
-        <w:spacing w:line="276" w:lineRule="auto" w:after="0"/>
-        <w:ind w:firstLine="420"/>
-      </w:pPr>
-      <w:r>
-        <w:rPr>
-          <w:rFonts w:ascii="宋体" w:hAnsi="宋体" w:eastAsia="宋体"/>
-          <w:color w:val="000000"/>
-        </w:rPr>
-        <w:t xml:space="preserve">notebook：8 个示例 notebook 纳入执行验收。</w:t>
-      </w:r>
-    </w:p>
-    <w:p>
-      <w:pPr>
-        <w:numPr>
-          <w:ilvl w:val="0"/>
-          <w:numId w:val="1013"/>
-        </w:numPr>
-        <w:pStyle w:val="Compact"/>
-        <w:spacing w:line="276" w:lineRule="auto" w:after="0"/>
-        <w:ind w:firstLine="420"/>
-      </w:pPr>
-      <w:r>
-        <w:rPr>
-          <w:rFonts w:ascii="宋体" w:hAnsi="宋体" w:eastAsia="宋体"/>
-          <w:color w:val="000000"/>
-        </w:rPr>
-        <w:t xml:space="preserve">论文复现：两篇 workflow 均读取</w:t>
-      </w:r>
-      <w:r>
-        <w:rPr>
-          <w:rFonts w:ascii="宋体" w:hAnsi="宋体" w:eastAsia="宋体"/>
-          <w:color w:val="000000"/>
-        </w:rPr>
-        <w:t xml:space="preserve"> </w:t>
-      </w:r>
-      <w:r>
-        <w:rPr>
-          <w:rStyle w:val="VerbatimChar"/>
-          <w:rFonts w:ascii="宋体" w:hAnsi="宋体" w:eastAsia="宋体"/>
-          <w:color w:val="000000"/>
-        </w:rPr>
-        <w:t xml:space="preserve">data/external</w:t>
-      </w:r>
-      <w:r>
-        <w:rPr>
-          <w:rFonts w:ascii="宋体" w:hAnsi="宋体" w:eastAsia="宋体"/>
-          <w:color w:val="000000"/>
-        </w:rPr>
-        <w:t xml:space="preserve"> </w:t>
-      </w:r>
-      <w:r>
-        <w:rPr>
-          <w:rFonts w:ascii="宋体" w:hAnsi="宋体" w:eastAsia="宋体"/>
-          <w:color w:val="000000"/>
-        </w:rPr>
-        <w:t xml:space="preserve">真实数据。</w:t>
-      </w:r>
-    </w:p>
-    <w:p>
-      <w:pPr>
-        <w:numPr>
-          <w:ilvl w:val="0"/>
-          <w:numId w:val="1013"/>
-        </w:numPr>
-        <w:pStyle w:val="Compact"/>
-        <w:spacing w:line="276" w:lineRule="auto" w:after="0"/>
-        <w:ind w:firstLine="420"/>
-      </w:pPr>
-      <w:r>
-        <w:rPr>
-          <w:rFonts w:ascii="宋体" w:hAnsi="宋体" w:eastAsia="宋体"/>
-          <w:color w:val="000000"/>
-        </w:rPr>
-        <w:t xml:space="preserve">输出文件：</w:t>
-      </w:r>
-      <w:r>
-        <w:rPr>
-          <w:rStyle w:val="VerbatimChar"/>
-          <w:rFonts w:ascii="宋体" w:hAnsi="宋体" w:eastAsia="宋体"/>
-          <w:color w:val="000000"/>
-        </w:rPr>
-        <w:t xml:space="preserve">history.csv</w:t>
-      </w:r>
-      <w:r>
-        <w:rPr>
-          <w:rFonts w:ascii="宋体" w:hAnsi="宋体" w:eastAsia="宋体"/>
-          <w:color w:val="000000"/>
-        </w:rPr>
-        <w:t xml:space="preserve">、</w:t>
-      </w:r>
-      <w:r>
-        <w:rPr>
-          <w:rStyle w:val="VerbatimChar"/>
-          <w:rFonts w:ascii="宋体" w:hAnsi="宋体" w:eastAsia="宋体"/>
-          <w:color w:val="000000"/>
-        </w:rPr>
-        <w:t xml:space="preserve">metrics.json</w:t>
-      </w:r>
-      <w:r>
-        <w:rPr>
-          <w:rFonts w:ascii="宋体" w:hAnsi="宋体" w:eastAsia="宋体"/>
-          <w:color w:val="000000"/>
-        </w:rPr>
-        <w:t xml:space="preserve">、</w:t>
-      </w:r>
-      <w:r>
-        <w:rPr>
-          <w:rStyle w:val="VerbatimChar"/>
-          <w:rFonts w:ascii="宋体" w:hAnsi="宋体" w:eastAsia="宋体"/>
-          <w:color w:val="000000"/>
-        </w:rPr>
-        <w:t xml:space="preserve">predictions.csv</w:t>
-      </w:r>
-      <w:r>
-        <w:rPr>
-          <w:rFonts w:ascii="宋体" w:hAnsi="宋体" w:eastAsia="宋体"/>
-          <w:color w:val="000000"/>
-        </w:rPr>
-        <w:t xml:space="preserve">、</w:t>
-      </w:r>
-      <w:r>
-        <w:rPr>
-          <w:rStyle w:val="VerbatimChar"/>
-          <w:rFonts w:ascii="宋体" w:hAnsi="宋体" w:eastAsia="宋体"/>
-          <w:color w:val="000000"/>
-        </w:rPr>
-        <w:t xml:space="preserve">comparison_metrics.csv</w:t>
-      </w:r>
-      <w:r>
-        <w:rPr>
-          <w:rFonts w:ascii="宋体" w:hAnsi="宋体" w:eastAsia="宋体"/>
-          <w:color w:val="000000"/>
-        </w:rPr>
-        <w:t xml:space="preserve">。</w:t>
-      </w:r>
-    </w:p>
-    <w:p>
-      <w:pPr>
-        <w:numPr>
-          <w:ilvl w:val="0"/>
-          <w:numId w:val="1013"/>
-        </w:numPr>
-        <w:pStyle w:val="Compact"/>
-        <w:spacing w:line="276" w:lineRule="auto" w:after="0"/>
-        <w:ind w:firstLine="420"/>
-      </w:pPr>
-      <w:r>
-        <w:rPr>
-          <w:rFonts w:ascii="宋体" w:hAnsi="宋体" w:eastAsia="宋体"/>
-          <w:color w:val="000000"/>
-        </w:rPr>
-        <w:t xml:space="preserve">文档材料：结题报告、测试报告、用户手册、安装手册、技术论文、成员贡献说明、答辩提纲和讲稿。</w:t>
-      </w:r>
-    </w:p>
-    <w:bookmarkStart w:id="34" w:name="汇报时间与语气控制"/>
-    <w:p>
-      <w:pPr>
-        <w:pStyle w:val="Heading3"/>
-      </w:pPr>
-      <w:r>
-        <w:rPr>
-          <w:rFonts w:ascii="宋体" w:hAnsi="宋体" w:eastAsia="宋体"/>
-          <w:color w:val="000000"/>
-        </w:rPr>
-        <w:t xml:space="preserve">13.1 汇报时间与语气控制</w:t>
+        <w:t xml:space="preserve">17. 汇报时间与语气控制</w:t>
       </w:r>
     </w:p>
     <w:tbl>
@@ -2669,24 +3014,24 @@
                 <w:color w:val="000000"/>
                 <w:sz w:val="21"/>
               </w:rPr>
-              <w:t xml:space="preserve">2 分钟</w:t>
-            </w:r>
-          </w:p>
-        </w:tc>
-        <w:tc>
-          <w:p>
-            <w:pPr>
-              <w:pStyle w:val="Compact"/>
-              <w:ind w:firstLine="0"/>
-              <w:jc w:val="left"/>
-            </w:pPr>
-            <w:r>
-              <w:rPr>
-                <w:rFonts w:ascii="宋体" w:hAnsi="宋体" w:eastAsia="宋体"/>
-                <w:color w:val="000000"/>
-                <w:sz w:val="21"/>
-              </w:rPr>
-              <w:t xml:space="preserve">强调真实训练和指标输出，同时说明复现边界</w:t>
+              <w:t xml:space="preserve">3 分钟</w:t>
+            </w:r>
+          </w:p>
+        </w:tc>
+        <w:tc>
+          <w:p>
+            <w:pPr>
+              <w:pStyle w:val="Compact"/>
+              <w:ind w:firstLine="0"/>
+              <w:jc w:val="left"/>
+            </w:pPr>
+            <w:r>
+              <w:rPr>
+                <w:rFonts w:ascii="宋体" w:hAnsi="宋体" w:eastAsia="宋体"/>
+                <w:color w:val="000000"/>
+                <w:sz w:val="21"/>
+              </w:rPr>
+              <w:t xml:space="preserve">说明选择依据、复现方式、指标口径和边界</w:t>
             </w:r>
           </w:p>
         </w:tc>
@@ -2745,131 +3090,8 @@
         </w:tc>
       </w:tr>
     </w:tbl>
-    <w:bookmarkEnd w:id="34"/>
-    <w:bookmarkEnd w:id="35"/>
-    <w:bookmarkStart w:id="36" w:name="成员分工不足与总结"/>
-    <w:p>
-      <w:pPr>
-        <w:pStyle w:val="Heading2"/>
-      </w:pPr>
-      <w:r>
-        <w:rPr>
-          <w:rFonts w:ascii="宋体" w:hAnsi="宋体" w:eastAsia="宋体"/>
-          <w:color w:val="000000"/>
-        </w:rPr>
-        <w:t xml:space="preserve">14. 成员分工、不足与总结</w:t>
-      </w:r>
-    </w:p>
-    <w:p>
-      <w:pPr>
-        <w:numPr>
-          <w:ilvl w:val="0"/>
-          <w:numId w:val="1014"/>
-        </w:numPr>
-        <w:pStyle w:val="Compact"/>
-        <w:spacing w:line="276" w:lineRule="auto" w:after="0"/>
-        <w:ind w:firstLine="420"/>
-      </w:pPr>
-      <w:r>
-        <w:rPr>
-          <w:rFonts w:ascii="宋体" w:hAnsi="宋体" w:eastAsia="宋体"/>
-          <w:color w:val="000000"/>
-        </w:rPr>
-        <w:t xml:space="preserve">zyj：系统架构、RUL 模型、训练 workflow 和论文复现，35%。</w:t>
-      </w:r>
-    </w:p>
-    <w:p>
-      <w:pPr>
-        <w:numPr>
-          <w:ilvl w:val="0"/>
-          <w:numId w:val="1014"/>
-        </w:numPr>
-        <w:pStyle w:val="Compact"/>
-        <w:spacing w:line="276" w:lineRule="auto" w:after="0"/>
-        <w:ind w:firstLine="420"/>
-      </w:pPr>
-      <w:r>
-        <w:rPr>
-          <w:rFonts w:ascii="宋体" w:hAnsi="宋体" w:eastAsia="宋体"/>
-          <w:color w:val="000000"/>
-        </w:rPr>
-        <w:t xml:space="preserve">cyy：数据处理、特征工程、loader 和数据文档，25%。</w:t>
-      </w:r>
-    </w:p>
-    <w:p>
-      <w:pPr>
-        <w:numPr>
-          <w:ilvl w:val="0"/>
-          <w:numId w:val="1014"/>
-        </w:numPr>
-        <w:pStyle w:val="Compact"/>
-        <w:spacing w:line="276" w:lineRule="auto" w:after="0"/>
-        <w:ind w:firstLine="420"/>
-      </w:pPr>
-      <w:r>
-        <w:rPr>
-          <w:rFonts w:ascii="宋体" w:hAnsi="宋体" w:eastAsia="宋体"/>
-          <w:color w:val="000000"/>
-        </w:rPr>
-        <w:t xml:space="preserve">zdh：概率分析基础能力、评价支持、测试报告，20%。</w:t>
-      </w:r>
-    </w:p>
-    <w:p>
-      <w:pPr>
-        <w:numPr>
-          <w:ilvl w:val="0"/>
-          <w:numId w:val="1014"/>
-        </w:numPr>
-        <w:pStyle w:val="Compact"/>
-        <w:spacing w:line="276" w:lineRule="auto" w:after="0"/>
-        <w:ind w:firstLine="420"/>
-      </w:pPr>
-      <w:r>
-        <w:rPr>
-          <w:rFonts w:ascii="宋体" w:hAnsi="宋体" w:eastAsia="宋体"/>
-          <w:color w:val="000000"/>
-        </w:rPr>
-        <w:t xml:space="preserve">zy：可视化、用户文档、答辩材料，20%。</w:t>
-      </w:r>
-    </w:p>
-    <w:p>
-      <w:pPr>
-        <w:numPr>
-          <w:ilvl w:val="0"/>
-          <w:numId w:val="1014"/>
-        </w:numPr>
-        <w:pStyle w:val="Compact"/>
-        <w:spacing w:line="276" w:lineRule="auto" w:after="0"/>
-        <w:ind w:firstLine="420"/>
-      </w:pPr>
-      <w:r>
-        <w:rPr>
-          <w:rFonts w:ascii="宋体" w:hAnsi="宋体" w:eastAsia="宋体"/>
-          <w:color w:val="000000"/>
-        </w:rPr>
-        <w:t xml:space="preserve">不足：训练规模较小，未做多随机种子和充分跨工况验证，温度信息尚未深入融合。</w:t>
-      </w:r>
-    </w:p>
-    <w:p>
-      <w:pPr>
-        <w:numPr>
-          <w:ilvl w:val="0"/>
-          <w:numId w:val="1014"/>
-        </w:numPr>
-        <w:pStyle w:val="Compact"/>
-        <w:spacing w:line="276" w:lineRule="auto" w:after="0"/>
-        <w:ind w:firstLine="420"/>
-      </w:pPr>
-      <w:r>
-        <w:rPr>
-          <w:rFonts w:ascii="宋体" w:hAnsi="宋体" w:eastAsia="宋体"/>
-          <w:color w:val="000000"/>
-        </w:rPr>
-        <w:t xml:space="preserve">总结：项目把真实数据读取、特征提取、RUL 建模、评价输出和课程文档交付实际跑通。</w:t>
-      </w:r>
-    </w:p>
-    <w:bookmarkEnd w:id="36"/>
-    <w:bookmarkEnd w:id="37"/>
+    <w:bookmarkEnd w:id="38"/>
+    <w:bookmarkEnd w:id="39"/>
     <w:sectPr>
       <w:pgMar w:top="1440" w:bottom="1440" w:left="1797" w:right="1797"/>
     </w:sectPr>
@@ -3097,6 +3319,12 @@
     <w:abstractNumId w:val="991"/>
   </w:num>
   <w:num w:numId="1014">
+    <w:abstractNumId w:val="991"/>
+  </w:num>
+  <w:num w:numId="1015">
+    <w:abstractNumId w:val="991"/>
+  </w:num>
+  <w:num w:numId="1016">
     <w:abstractNumId w:val="991"/>
   </w:num>
 </w:numbering>

</xml_diff>

<commit_message>
docs: simplify final deck wording
</commit_message>
<xml_diff>
--- a/docx/final/20_结题答辩提纲.docx
+++ b/docx/final/20_结题答辩提纲.docx
@@ -1086,7 +1086,7 @@
       </w:r>
     </w:p>
     <w:bookmarkEnd w:id="22"/>
-    <w:bookmarkStart w:id="23" w:name="项目目标与交付物"/>
+    <w:bookmarkStart w:id="23" w:name="项目目标和交付内容"/>
     <w:p>
       <w:pPr>
         <w:pStyle w:val="Heading2"/>
@@ -1096,7 +1096,7 @@
           <w:rFonts w:ascii="宋体" w:hAnsi="宋体" w:eastAsia="宋体"/>
           <w:color w:val="000000"/>
         </w:rPr>
-        <w:t xml:space="preserve">2. 项目目标与交付物</w:t>
+        <w:t xml:space="preserve">2. 项目目标和交付内容</w:t>
       </w:r>
     </w:p>
     <w:p>
@@ -1114,7 +1114,7 @@
           <w:rFonts w:ascii="宋体" w:hAnsi="宋体" w:eastAsia="宋体"/>
           <w:color w:val="000000"/>
         </w:rPr>
-        <w:t xml:space="preserve">目标：把真实轴承振动数据转成可复现的 RUL 预测流程。</w:t>
+        <w:t xml:space="preserve">目标：实现一个可运行的轴承 RUL 预测系统。</w:t>
       </w:r>
     </w:p>
     <w:p>
@@ -1240,7 +1240,7 @@
       </w:r>
     </w:p>
     <w:bookmarkEnd w:id="24"/>
-    <w:bookmarkStart w:id="25" w:name="数据来源与时间语义"/>
+    <w:bookmarkStart w:id="25" w:name="两个数据集的时间组织方式"/>
     <w:p>
       <w:pPr>
         <w:pStyle w:val="Heading2"/>
@@ -1250,7 +1250,7 @@
           <w:rFonts w:ascii="宋体" w:hAnsi="宋体" w:eastAsia="宋体"/>
           <w:color w:val="000000"/>
         </w:rPr>
-        <w:t xml:space="preserve">4. 数据来源与时间语义</w:t>
+        <w:t xml:space="preserve">4. 两个数据集的时间组织方式</w:t>
       </w:r>
     </w:p>
     <w:p>
@@ -1634,11 +1634,11 @@
           <w:rFonts w:ascii="宋体" w:hAnsi="宋体" w:eastAsia="宋体"/>
           <w:color w:val="000000"/>
         </w:rPr>
-        <w:t xml:space="preserve">结论：代表曲线只说明局部现象，多轴承摘要用于补充统计视角。</w:t>
+        <w:t xml:space="preserve">结论：代表曲线用于解释特征含义，多轴承摘要用于补充不同工况和不同轴承的差异。</w:t>
       </w:r>
     </w:p>
     <w:bookmarkEnd w:id="28"/>
-    <w:bookmarkStart w:id="29" w:name="特征工程与-rul-标签构造"/>
+    <w:bookmarkStart w:id="29" w:name="维特征与-rul-标签"/>
     <w:p>
       <w:pPr>
         <w:pStyle w:val="Heading2"/>
@@ -1648,7 +1648,7 @@
           <w:rFonts w:ascii="宋体" w:hAnsi="宋体" w:eastAsia="宋体"/>
           <w:color w:val="000000"/>
         </w:rPr>
-        <w:t xml:space="preserve">8. 特征工程与 RUL 标签构造</w:t>
+        <w:t xml:space="preserve">8. 19 维特征与 RUL 标签</w:t>
       </w:r>
     </w:p>
     <w:p>
@@ -2070,7 +2070,7 @@
       </w:r>
     </w:p>
     <w:bookmarkEnd w:id="31"/>
-    <w:bookmarkStart w:id="32" w:name="难点二信号到序列特征"/>
+    <w:bookmarkStart w:id="32" w:name="难点二从振动快照到特征序列"/>
     <w:p>
       <w:pPr>
         <w:pStyle w:val="Heading2"/>
@@ -2080,7 +2080,7 @@
           <w:rFonts w:ascii="宋体" w:hAnsi="宋体" w:eastAsia="宋体"/>
           <w:color w:val="000000"/>
         </w:rPr>
-        <w:t xml:space="preserve">11. 难点二：信号到序列特征</w:t>
+        <w:t xml:space="preserve">11. 难点二：从振动快照到特征序列</w:t>
       </w:r>
     </w:p>
     <w:p>
@@ -2134,7 +2134,7 @@
           <w:rFonts w:ascii="宋体" w:hAnsi="宋体" w:eastAsia="宋体"/>
           <w:color w:val="000000"/>
         </w:rPr>
-        <w:t xml:space="preserve">模型看到的是一段连续变化，而不是孤立的一个点。</w:t>
+        <w:t xml:space="preserve">特征序列保留了快照之间的先后关系，模型输入不再只是单个快照。</w:t>
       </w:r>
     </w:p>
     <w:bookmarkEnd w:id="32"/>
@@ -2206,7 +2206,7 @@
       </w:r>
     </w:p>
     <w:bookmarkEnd w:id="33"/>
-    <w:bookmarkStart w:id="34" w:name="复现实验怎么做"/>
+    <w:bookmarkStart w:id="34" w:name="复现实验的执行步骤"/>
     <w:p>
       <w:pPr>
         <w:pStyle w:val="Heading2"/>
@@ -2216,7 +2216,7 @@
           <w:rFonts w:ascii="宋体" w:hAnsi="宋体" w:eastAsia="宋体"/>
           <w:color w:val="000000"/>
         </w:rPr>
-        <w:t xml:space="preserve">13. 复现实验怎么做</w:t>
+        <w:t xml:space="preserve">13. 复现实验的执行步骤</w:t>
       </w:r>
     </w:p>
     <w:p>
@@ -2417,7 +2417,7 @@
       </w:r>
     </w:p>
     <w:bookmarkEnd w:id="34"/>
-    <w:bookmarkStart w:id="35" w:name="指标与结果边界"/>
+    <w:bookmarkStart w:id="35" w:name="复现指标与结果边界"/>
     <w:p>
       <w:pPr>
         <w:pStyle w:val="Heading2"/>
@@ -2427,7 +2427,7 @@
           <w:rFonts w:ascii="宋体" w:hAnsi="宋体" w:eastAsia="宋体"/>
           <w:color w:val="000000"/>
         </w:rPr>
-        <w:t xml:space="preserve">14. 指标与结果边界</w:t>
+        <w:t xml:space="preserve">14. 复现指标与结果边界</w:t>
       </w:r>
     </w:p>
     <w:p>

</xml_diff>

<commit_message>
Strengthen tsfresh issue 4 analysis
</commit_message>
<xml_diff>
--- a/docx/final/20_结题答辩提纲.docx
+++ b/docx/final/20_结题答辩提纲.docx
@@ -28,7 +28,7 @@
         </w:p>
       </w:sdtContent>
     </w:sdt>
-    <w:bookmarkStart w:id="39" w:name="工业轴承设备剩余寿命预测系统的实现结题答辩提纲"/>
+    <w:bookmarkStart w:id="41" w:name="工业轴承设备剩余寿命预测系统的实现结题答辩提纲"/>
     <w:p>
       <w:pPr>
         <w:pStyle w:val="Heading1"/>
@@ -471,7 +471,7 @@
                 <w:color w:val="000000"/>
                 <w:sz w:val="21"/>
               </w:rPr>
-              <w:t xml:space="preserve">V4.0</w:t>
+              <w:t xml:space="preserve">V5.0</w:t>
             </w:r>
           </w:p>
         </w:tc>
@@ -507,7 +507,7 @@
                 <w:color w:val="000000"/>
                 <w:sz w:val="21"/>
               </w:rPr>
-              <w:t xml:space="preserve">2026-06-14</w:t>
+              <w:t xml:space="preserve">2026-06-17</w:t>
             </w:r>
           </w:p>
         </w:tc>
@@ -980,6 +980,76 @@
           </w:p>
         </w:tc>
       </w:tr>
+      <w:tr>
+        <w:tc>
+          <w:p>
+            <w:pPr>
+              <w:pStyle w:val="Compact"/>
+              <w:ind w:firstLine="0"/>
+              <w:jc w:val="left"/>
+            </w:pPr>
+            <w:r>
+              <w:rPr>
+                <w:rFonts w:ascii="宋体" w:hAnsi="宋体" w:eastAsia="宋体"/>
+                <w:color w:val="000000"/>
+                <w:sz w:val="21"/>
+              </w:rPr>
+              <w:t xml:space="preserve">V5.0</w:t>
+            </w:r>
+          </w:p>
+        </w:tc>
+        <w:tc>
+          <w:p>
+            <w:pPr>
+              <w:pStyle w:val="Compact"/>
+              <w:ind w:firstLine="0"/>
+              <w:jc w:val="left"/>
+            </w:pPr>
+            <w:r>
+              <w:rPr>
+                <w:rFonts w:ascii="宋体" w:hAnsi="宋体" w:eastAsia="宋体"/>
+                <w:color w:val="000000"/>
+                <w:sz w:val="21"/>
+              </w:rPr>
+              <w:t xml:space="preserve">2026-06-17</w:t>
+            </w:r>
+          </w:p>
+        </w:tc>
+        <w:tc>
+          <w:p>
+            <w:pPr>
+              <w:pStyle w:val="Compact"/>
+              <w:ind w:firstLine="0"/>
+              <w:jc w:val="left"/>
+            </w:pPr>
+            <w:r>
+              <w:rPr>
+                <w:rFonts w:ascii="宋体" w:hAnsi="宋体" w:eastAsia="宋体"/>
+                <w:color w:val="000000"/>
+                <w:sz w:val="21"/>
+              </w:rPr>
+              <w:t xml:space="preserve">项目组</w:t>
+            </w:r>
+          </w:p>
+        </w:tc>
+        <w:tc>
+          <w:p>
+            <w:pPr>
+              <w:pStyle w:val="Compact"/>
+              <w:ind w:firstLine="0"/>
+              <w:jc w:val="left"/>
+            </w:pPr>
+            <w:r>
+              <w:rPr>
+                <w:rFonts w:ascii="宋体" w:hAnsi="宋体" w:eastAsia="宋体"/>
+                <w:color w:val="000000"/>
+                <w:sz w:val="21"/>
+              </w:rPr>
+              <w:t xml:space="preserve">同步指标驱动补充实验，明确 external SOTA、tsfresh 和 RULSurv 边界</w:t>
+            </w:r>
+          </w:p>
+        </w:tc>
+      </w:tr>
     </w:tbl>
     <w:bookmarkEnd w:id="21"/>
     <w:bookmarkStart w:id="22" w:name="标题页"/>
@@ -1132,7 +1202,7 @@
           <w:rFonts w:ascii="宋体" w:hAnsi="宋体" w:eastAsia="宋体"/>
           <w:color w:val="000000"/>
         </w:rPr>
-        <w:t xml:space="preserve">汇报重点：数据理解、特征分析、工程实现、论文复现、测试验收。</w:t>
+        <w:t xml:space="preserve">汇报重点：需求分析、数据集介绍、项目架构、特征分析、训练展示、结果边界和 Q&amp;A。</w:t>
       </w:r>
     </w:p>
     <w:p>
@@ -1150,7 +1220,7 @@
           <w:rFonts w:ascii="宋体" w:hAnsi="宋体" w:eastAsia="宋体"/>
           <w:color w:val="000000"/>
         </w:rPr>
-        <w:t xml:space="preserve">已交付内容：两个数据集 loader、特征工程、RUL 标签、模型训练、评价指标、notebook 示例、结题文档。</w:t>
+        <w:t xml:space="preserve">已交付内容：两个数据集 loader、特征工程、RUL 标签、模型训练、评价指标、tsfresh/sktime/RULSurv 补充证据、notebook 示例和结题文档。</w:t>
       </w:r>
     </w:p>
     <w:p>
@@ -1875,6 +1945,331 @@
         <w:t xml:space="preserve">生成；若只用快照序号，则标注为 snapshot-level RUL。</w:t>
       </w:r>
     </w:p>
+    <w:p>
+      <w:pPr>
+        <w:numPr>
+          <w:ilvl w:val="0"/>
+          <w:numId w:val="1008"/>
+        </w:numPr>
+        <w:pStyle w:val="Compact"/>
+        <w:spacing w:line="276" w:lineRule="auto" w:after="0"/>
+        <w:ind w:firstLine="420"/>
+      </w:pPr>
+      <w:r>
+        <w:rPr>
+          <w:rFonts w:ascii="宋体" w:hAnsi="宋体" w:eastAsia="宋体"/>
+          <w:color w:val="000000"/>
+        </w:rPr>
+        <w:t xml:space="preserve">tsfresh 已补充 Minimal/Efficient train-only 自动特征筛选和 held-out baseline：Minimal top feature</w:t>
+      </w:r>
+      <w:r>
+        <w:rPr>
+          <w:rFonts w:ascii="宋体" w:hAnsi="宋体" w:eastAsia="宋体"/>
+          <w:color w:val="000000"/>
+        </w:rPr>
+        <w:t xml:space="preserve"> </w:t>
+      </w:r>
+      <w:r>
+        <w:rPr>
+          <w:rStyle w:val="VerbatimChar"/>
+          <w:rFonts w:ascii="宋体" w:hAnsi="宋体" w:eastAsia="宋体"/>
+          <w:color w:val="000000"/>
+        </w:rPr>
+        <w:t xml:space="preserve">vertical__maximum</w:t>
+      </w:r>
+      <w:r>
+        <w:rPr>
+          <w:rFonts w:ascii="宋体" w:hAnsi="宋体" w:eastAsia="宋体"/>
+          <w:color w:val="000000"/>
+        </w:rPr>
+        <w:t xml:space="preserve"> </w:t>
+      </w:r>
+      <w:r>
+        <w:rPr>
+          <w:rFonts w:ascii="宋体" w:hAnsi="宋体" w:eastAsia="宋体"/>
+          <w:color w:val="000000"/>
+        </w:rPr>
+        <w:t xml:space="preserve">correlation 约</w:t>
+      </w:r>
+      <w:r>
+        <w:rPr>
+          <w:rFonts w:ascii="宋体" w:hAnsi="宋体" w:eastAsia="宋体"/>
+          <w:color w:val="000000"/>
+        </w:rPr>
+        <w:t xml:space="preserve"> </w:t>
+      </w:r>
+      <w:r>
+        <w:rPr>
+          <w:rStyle w:val="VerbatimChar"/>
+          <w:rFonts w:ascii="宋体" w:hAnsi="宋体" w:eastAsia="宋体"/>
+          <w:color w:val="000000"/>
+        </w:rPr>
+        <w:t xml:space="preserve">0.200994</w:t>
+      </w:r>
+      <w:r>
+        <w:rPr>
+          <w:rFonts w:ascii="宋体" w:hAnsi="宋体" w:eastAsia="宋体"/>
+          <w:color w:val="000000"/>
+        </w:rPr>
+        <w:t xml:space="preserve">，Efficient top feature</w:t>
+      </w:r>
+      <w:r>
+        <w:rPr>
+          <w:rFonts w:ascii="宋体" w:hAnsi="宋体" w:eastAsia="宋体"/>
+          <w:color w:val="000000"/>
+        </w:rPr>
+        <w:t xml:space="preserve"> </w:t>
+      </w:r>
+      <w:r>
+        <w:rPr>
+          <w:rStyle w:val="VerbatimChar"/>
+          <w:rFonts w:ascii="宋体" w:hAnsi="宋体" w:eastAsia="宋体"/>
+          <w:color w:val="000000"/>
+        </w:rPr>
+        <w:t xml:space="preserve">horizontal__partial_autocorrelation__lag_1</w:t>
+      </w:r>
+      <w:r>
+        <w:rPr>
+          <w:rFonts w:ascii="宋体" w:hAnsi="宋体" w:eastAsia="宋体"/>
+          <w:color w:val="000000"/>
+        </w:rPr>
+        <w:t xml:space="preserve"> </w:t>
+      </w:r>
+      <w:r>
+        <w:rPr>
+          <w:rFonts w:ascii="宋体" w:hAnsi="宋体" w:eastAsia="宋体"/>
+          <w:color w:val="000000"/>
+        </w:rPr>
+        <w:t xml:space="preserve">correlation 约</w:t>
+      </w:r>
+      <w:r>
+        <w:rPr>
+          <w:rFonts w:ascii="宋体" w:hAnsi="宋体" w:eastAsia="宋体"/>
+          <w:color w:val="000000"/>
+        </w:rPr>
+        <w:t xml:space="preserve"> </w:t>
+      </w:r>
+      <w:r>
+        <w:rPr>
+          <w:rStyle w:val="VerbatimChar"/>
+          <w:rFonts w:ascii="宋体" w:hAnsi="宋体" w:eastAsia="宋体"/>
+          <w:color w:val="000000"/>
+        </w:rPr>
+        <w:t xml:space="preserve">0.424468</w:t>
+      </w:r>
+      <w:r>
+        <w:rPr>
+          <w:rFonts w:ascii="宋体" w:hAnsi="宋体" w:eastAsia="宋体"/>
+          <w:color w:val="000000"/>
+        </w:rPr>
+        <w:t xml:space="preserve">；</w:t>
+      </w:r>
+      <w:r>
+        <w:rPr>
+          <w:rStyle w:val="VerbatimChar"/>
+          <w:rFonts w:ascii="宋体" w:hAnsi="宋体" w:eastAsia="宋体"/>
+          <w:color w:val="000000"/>
+        </w:rPr>
+        <w:t xml:space="preserve">tsfresh Minimal selected + RandomForest</w:t>
+      </w:r>
+      <w:r>
+        <w:rPr>
+          <w:rFonts w:ascii="宋体" w:hAnsi="宋体" w:eastAsia="宋体"/>
+          <w:color w:val="000000"/>
+        </w:rPr>
+        <w:t xml:space="preserve"> </w:t>
+      </w:r>
+      <w:r>
+        <w:rPr>
+          <w:rFonts w:ascii="宋体" w:hAnsi="宋体" w:eastAsia="宋体"/>
+          <w:color w:val="000000"/>
+        </w:rPr>
+        <w:t xml:space="preserve">mean normalized RMSE 为</w:t>
+      </w:r>
+      <w:r>
+        <w:rPr>
+          <w:rFonts w:ascii="宋体" w:hAnsi="宋体" w:eastAsia="宋体"/>
+          <w:color w:val="000000"/>
+        </w:rPr>
+        <w:t xml:space="preserve"> </w:t>
+      </w:r>
+      <w:r>
+        <w:rPr>
+          <w:rStyle w:val="VerbatimChar"/>
+          <w:rFonts w:ascii="宋体" w:hAnsi="宋体" w:eastAsia="宋体"/>
+          <w:color w:val="000000"/>
+        </w:rPr>
+        <w:t xml:space="preserve">0.315629</w:t>
+      </w:r>
+      <w:r>
+        <w:rPr>
+          <w:rFonts w:ascii="宋体" w:hAnsi="宋体" w:eastAsia="宋体"/>
+          <w:color w:val="000000"/>
+        </w:rPr>
+        <w:t xml:space="preserve">，</w:t>
+      </w:r>
+      <w:r>
+        <w:rPr>
+          <w:rStyle w:val="VerbatimChar"/>
+          <w:rFonts w:ascii="宋体" w:hAnsi="宋体" w:eastAsia="宋体"/>
+          <w:color w:val="000000"/>
+        </w:rPr>
+        <w:t xml:space="preserve">tsfresh Efficient selected + RandomForest</w:t>
+      </w:r>
+      <w:r>
+        <w:rPr>
+          <w:rFonts w:ascii="宋体" w:hAnsi="宋体" w:eastAsia="宋体"/>
+          <w:color w:val="000000"/>
+        </w:rPr>
+        <w:t xml:space="preserve"> </w:t>
+      </w:r>
+      <w:r>
+        <w:rPr>
+          <w:rFonts w:ascii="宋体" w:hAnsi="宋体" w:eastAsia="宋体"/>
+          <w:color w:val="000000"/>
+        </w:rPr>
+        <w:t xml:space="preserve">为</w:t>
+      </w:r>
+      <w:r>
+        <w:rPr>
+          <w:rFonts w:ascii="宋体" w:hAnsi="宋体" w:eastAsia="宋体"/>
+          <w:color w:val="000000"/>
+        </w:rPr>
+        <w:t xml:space="preserve"> </w:t>
+      </w:r>
+      <w:r>
+        <w:rPr>
+          <w:rStyle w:val="VerbatimChar"/>
+          <w:rFonts w:ascii="宋体" w:hAnsi="宋体" w:eastAsia="宋体"/>
+          <w:color w:val="000000"/>
+        </w:rPr>
+        <w:t xml:space="preserve">0.318682</w:t>
+      </w:r>
+      <w:r>
+        <w:rPr>
+          <w:rFonts w:ascii="宋体" w:hAnsi="宋体" w:eastAsia="宋体"/>
+          <w:color w:val="000000"/>
+        </w:rPr>
+        <w:t xml:space="preserve">，</w:t>
+      </w:r>
+      <w:r>
+        <w:rPr>
+          <w:rStyle w:val="VerbatimChar"/>
+          <w:rFonts w:ascii="宋体" w:hAnsi="宋体" w:eastAsia="宋体"/>
+          <w:color w:val="000000"/>
+        </w:rPr>
+        <w:t xml:space="preserve">manual 19 + Efficient selected</w:t>
+      </w:r>
+      <w:r>
+        <w:rPr>
+          <w:rFonts w:ascii="宋体" w:hAnsi="宋体" w:eastAsia="宋体"/>
+          <w:color w:val="000000"/>
+        </w:rPr>
+        <w:t xml:space="preserve"> </w:t>
+      </w:r>
+      <w:r>
+        <w:rPr>
+          <w:rFonts w:ascii="宋体" w:hAnsi="宋体" w:eastAsia="宋体"/>
+          <w:color w:val="000000"/>
+        </w:rPr>
+        <w:t xml:space="preserve">为</w:t>
+      </w:r>
+      <w:r>
+        <w:rPr>
+          <w:rFonts w:ascii="宋体" w:hAnsi="宋体" w:eastAsia="宋体"/>
+          <w:color w:val="000000"/>
+        </w:rPr>
+        <w:t xml:space="preserve"> </w:t>
+      </w:r>
+      <w:r>
+        <w:rPr>
+          <w:rStyle w:val="VerbatimChar"/>
+          <w:rFonts w:ascii="宋体" w:hAnsi="宋体" w:eastAsia="宋体"/>
+          <w:color w:val="000000"/>
+        </w:rPr>
+        <w:t xml:space="preserve">0.319927</w:t>
+      </w:r>
+      <w:r>
+        <w:rPr>
+          <w:rFonts w:ascii="宋体" w:hAnsi="宋体" w:eastAsia="宋体"/>
+          <w:color w:val="000000"/>
+        </w:rPr>
+        <w:t xml:space="preserve">，均优于手工 19 维 RandomForest 的</w:t>
+      </w:r>
+      <w:r>
+        <w:rPr>
+          <w:rFonts w:ascii="宋体" w:hAnsi="宋体" w:eastAsia="宋体"/>
+          <w:color w:val="000000"/>
+        </w:rPr>
+        <w:t xml:space="preserve"> </w:t>
+      </w:r>
+      <w:r>
+        <w:rPr>
+          <w:rStyle w:val="VerbatimChar"/>
+          <w:rFonts w:ascii="宋体" w:hAnsi="宋体" w:eastAsia="宋体"/>
+          <w:color w:val="000000"/>
+        </w:rPr>
+        <w:t xml:space="preserve">0.345365</w:t>
+      </w:r>
+      <w:r>
+        <w:rPr>
+          <w:rFonts w:ascii="宋体" w:hAnsi="宋体" w:eastAsia="宋体"/>
+          <w:color w:val="000000"/>
+        </w:rPr>
+        <w:t xml:space="preserve">，但弱于</w:t>
+      </w:r>
+      <w:r>
+        <w:rPr>
+          <w:rFonts w:ascii="宋体" w:hAnsi="宋体" w:eastAsia="宋体"/>
+          <w:color w:val="000000"/>
+        </w:rPr>
+        <w:t xml:space="preserve"> </w:t>
+      </w:r>
+      <w:r>
+        <w:rPr>
+          <w:rStyle w:val="VerbatimChar"/>
+          <w:rFonts w:ascii="宋体" w:hAnsi="宋体" w:eastAsia="宋体"/>
+          <w:color w:val="000000"/>
+        </w:rPr>
+        <w:t xml:space="preserve">sktime RocketRegressor</w:t>
+      </w:r>
+      <w:r>
+        <w:rPr>
+          <w:rFonts w:ascii="宋体" w:hAnsi="宋体" w:eastAsia="宋体"/>
+          <w:color w:val="000000"/>
+        </w:rPr>
+        <w:t xml:space="preserve"> </w:t>
+      </w:r>
+      <w:r>
+        <w:rPr>
+          <w:rFonts w:ascii="宋体" w:hAnsi="宋体" w:eastAsia="宋体"/>
+          <w:color w:val="000000"/>
+        </w:rPr>
+        <w:t xml:space="preserve">的</w:t>
+      </w:r>
+      <w:r>
+        <w:rPr>
+          <w:rFonts w:ascii="宋体" w:hAnsi="宋体" w:eastAsia="宋体"/>
+          <w:color w:val="000000"/>
+        </w:rPr>
+        <w:t xml:space="preserve"> </w:t>
+      </w:r>
+      <w:r>
+        <w:rPr>
+          <w:rStyle w:val="VerbatimChar"/>
+          <w:rFonts w:ascii="宋体" w:hAnsi="宋体" w:eastAsia="宋体"/>
+          <w:color w:val="000000"/>
+        </w:rPr>
+        <w:t xml:space="preserve">0.263706</w:t>
+      </w:r>
+      <w:r>
+        <w:rPr>
+          <w:rFonts w:ascii="宋体" w:hAnsi="宋体" w:eastAsia="宋体"/>
+          <w:color w:val="000000"/>
+        </w:rPr>
+        <w:t xml:space="preserve">，因此仍只能作为自动特征分析旁证。</w:t>
+      </w:r>
+    </w:p>
     <w:bookmarkEnd w:id="29"/>
     <w:bookmarkStart w:id="30" w:name="系统按数据特征模型和评价分层"/>
     <w:p>
@@ -2567,7 +2962,7 @@
           <w:rFonts w:ascii="宋体" w:hAnsi="宋体" w:eastAsia="宋体"/>
           <w:color w:val="000000"/>
         </w:rPr>
-        <w:t xml:space="preserve">全量 pytest：39 个测试通过。</w:t>
+        <w:t xml:space="preserve">全量 pytest：59 个测试通过。</w:t>
       </w:r>
     </w:p>
     <w:p>
@@ -2850,7 +3245,36 @@
           <w:rFonts w:ascii="宋体" w:hAnsi="宋体" w:eastAsia="宋体"/>
           <w:color w:val="000000"/>
         </w:rPr>
-        <w:t xml:space="preserve">不足：训练规模较小，未做多随机种子和充分跨工况验证，温度信息尚未深入融合。</w:t>
+        <w:t xml:space="preserve">不足：训练规模仍有限，外部 SOTA 尚未本地重跑，tsfresh 相关性整体偏弱，RULSurv held-out 结果是</w:t>
+      </w:r>
+      <w:r>
+        <w:rPr>
+          <w:rFonts w:ascii="宋体" w:hAnsi="宋体" w:eastAsia="宋体"/>
+          <w:color w:val="000000"/>
+        </w:rPr>
+        <w:t xml:space="preserve"> </w:t>
+      </w:r>
+      <w:r>
+        <w:rPr>
+          <w:rStyle w:val="VerbatimChar"/>
+          <w:rFonts w:ascii="宋体" w:hAnsi="宋体" w:eastAsia="宋体"/>
+          <w:color w:val="000000"/>
+        </w:rPr>
+        <w:t xml:space="preserve">survival_probability=0.25</w:t>
+      </w:r>
+      <w:r>
+        <w:rPr>
+          <w:rFonts w:ascii="宋体" w:hAnsi="宋体" w:eastAsia="宋体"/>
+          <w:color w:val="000000"/>
+        </w:rPr>
+        <w:t xml:space="preserve"> </w:t>
+      </w:r>
+      <w:r>
+        <w:rPr>
+          <w:rFonts w:ascii="宋体" w:hAnsi="宋体" w:eastAsia="宋体"/>
+          <w:color w:val="000000"/>
+        </w:rPr>
+        <w:t xml:space="preserve">的保守解码迁移结果，温度信息尚未深入融合。</w:t>
       </w:r>
     </w:p>
     <w:p>
@@ -2886,11 +3310,11 @@
           <w:rFonts w:ascii="宋体" w:hAnsi="宋体" w:eastAsia="宋体"/>
           <w:color w:val="000000"/>
         </w:rPr>
-        <w:t xml:space="preserve">结尾口径：成果是链路、50 epoch 训练证据和论文 gap 对照；边界是每轴承 96 快照抽样与非作者源码级复现，后续是全量训练、多随机种子、温度融合和跨工况调参。</w:t>
+        <w:t xml:space="preserve">结尾口径：成果是链路、50 epoch 训练证据、论文 gap 对照和指标驱动补充实验；边界是每轴承 96 快照抽样、外部 SOTA 仅 source pin / 依赖 probe、tsfresh 不是核心性能突破、RULSurv held-out pass 是项目迁移策略。</w:t>
       </w:r>
     </w:p>
     <w:bookmarkEnd w:id="37"/>
-    <w:bookmarkStart w:id="38" w:name="汇报时间与语气控制"/>
+    <w:bookmarkStart w:id="38" w:name="指标驱动补充实验与边界"/>
     <w:p>
       <w:pPr>
         <w:pStyle w:val="Heading2"/>
@@ -2900,7 +3324,286 @@
           <w:rFonts w:ascii="宋体" w:hAnsi="宋体" w:eastAsia="宋体"/>
           <w:color w:val="000000"/>
         </w:rPr>
-        <w:t xml:space="preserve">17. 汇报时间与语气控制</w:t>
+        <w:t xml:space="preserve">17. 指标驱动补充实验与边界</w:t>
+      </w:r>
+    </w:p>
+    <w:p>
+      <w:pPr>
+        <w:numPr>
+          <w:ilvl w:val="0"/>
+          <w:numId w:val="1017"/>
+        </w:numPr>
+        <w:pStyle w:val="Compact"/>
+        <w:spacing w:line="276" w:lineRule="auto" w:after="0"/>
+        <w:ind w:firstLine="420"/>
+      </w:pPr>
+      <w:r>
+        <w:rPr>
+          <w:rFonts w:ascii="宋体" w:hAnsi="宋体" w:eastAsia="宋体"/>
+          <w:color w:val="000000"/>
+        </w:rPr>
+        <w:t xml:space="preserve">外部 SOTA：AutoRUL、GNN_RUL_Benchmarking、Weibull KIML 已完成 source pin 和依赖 probe，尚未在本地跑出指标，不能宣称这些路线已复现完成。</w:t>
+      </w:r>
+    </w:p>
+    <w:p>
+      <w:pPr>
+        <w:numPr>
+          <w:ilvl w:val="0"/>
+          <w:numId w:val="1017"/>
+        </w:numPr>
+        <w:pStyle w:val="Compact"/>
+        <w:spacing w:line="276" w:lineRule="auto" w:after="0"/>
+        <w:ind w:firstLine="420"/>
+      </w:pPr>
+      <w:r>
+        <w:rPr>
+          <w:rFonts w:ascii="宋体" w:hAnsi="宋体" w:eastAsia="宋体"/>
+          <w:color w:val="000000"/>
+        </w:rPr>
+        <w:t xml:space="preserve">tsfresh：已完成 Minimal/Efficient train-only 特征筛选、held-out baseline 和 manual+tsfresh 融合输入验证，但相关性与 RF baseline 证据不足以支撑核心性能突破，只能作为自动特征分析旁证。</w:t>
+      </w:r>
+    </w:p>
+    <w:p>
+      <w:pPr>
+        <w:numPr>
+          <w:ilvl w:val="0"/>
+          <w:numId w:val="1017"/>
+        </w:numPr>
+        <w:pStyle w:val="Compact"/>
+        <w:spacing w:line="276" w:lineRule="auto" w:after="0"/>
+        <w:ind w:firstLine="420"/>
+      </w:pPr>
+      <w:r>
+        <w:rPr>
+          <w:rFonts w:ascii="宋体" w:hAnsi="宋体" w:eastAsia="宋体"/>
+          <w:color w:val="000000"/>
+        </w:rPr>
+        <w:t xml:space="preserve">sktime：</w:t>
+      </w:r>
+      <w:r>
+        <w:rPr>
+          <w:rStyle w:val="VerbatimChar"/>
+          <w:rFonts w:ascii="宋体" w:hAnsi="宋体" w:eastAsia="宋体"/>
+          <w:color w:val="000000"/>
+        </w:rPr>
+        <w:t xml:space="preserve">RocketRegressor</w:t>
+      </w:r>
+      <w:r>
+        <w:rPr>
+          <w:rFonts w:ascii="宋体" w:hAnsi="宋体" w:eastAsia="宋体"/>
+          <w:color w:val="000000"/>
+        </w:rPr>
+        <w:t xml:space="preserve"> </w:t>
+      </w:r>
+      <w:r>
+        <w:rPr>
+          <w:rFonts w:ascii="宋体" w:hAnsi="宋体" w:eastAsia="宋体"/>
+          <w:color w:val="000000"/>
+        </w:rPr>
+        <w:t xml:space="preserve">已接入同一 held-out split，mean normalized RMSE 为</w:t>
+      </w:r>
+      <w:r>
+        <w:rPr>
+          <w:rFonts w:ascii="宋体" w:hAnsi="宋体" w:eastAsia="宋体"/>
+          <w:color w:val="000000"/>
+        </w:rPr>
+        <w:t xml:space="preserve"> </w:t>
+      </w:r>
+      <w:r>
+        <w:rPr>
+          <w:rStyle w:val="VerbatimChar"/>
+          <w:rFonts w:ascii="宋体" w:hAnsi="宋体" w:eastAsia="宋体"/>
+          <w:color w:val="000000"/>
+        </w:rPr>
+        <w:t xml:space="preserve">0.263706</w:t>
+      </w:r>
+      <w:r>
+        <w:rPr>
+          <w:rFonts w:ascii="宋体" w:hAnsi="宋体" w:eastAsia="宋体"/>
+          <w:color w:val="000000"/>
+        </w:rPr>
+        <w:t xml:space="preserve">，当前优于 tsfresh RandomForest。</w:t>
+      </w:r>
+    </w:p>
+    <w:p>
+      <w:pPr>
+        <w:numPr>
+          <w:ilvl w:val="0"/>
+          <w:numId w:val="1017"/>
+        </w:numPr>
+        <w:pStyle w:val="Compact"/>
+        <w:spacing w:line="276" w:lineRule="auto" w:after="0"/>
+        <w:ind w:firstLine="420"/>
+      </w:pPr>
+      <w:r>
+        <w:rPr>
+          <w:rFonts w:ascii="宋体" w:hAnsi="宋体" w:eastAsia="宋体"/>
+          <w:color w:val="000000"/>
+        </w:rPr>
+        <w:t xml:space="preserve">RULSurv：row-level 协议复现 mean true MAE 为</w:t>
+      </w:r>
+      <w:r>
+        <w:rPr>
+          <w:rFonts w:ascii="宋体" w:hAnsi="宋体" w:eastAsia="宋体"/>
+          <w:color w:val="000000"/>
+        </w:rPr>
+        <w:t xml:space="preserve"> </w:t>
+      </w:r>
+      <w:r>
+        <w:rPr>
+          <w:rStyle w:val="VerbatimChar"/>
+          <w:rFonts w:ascii="宋体" w:hAnsi="宋体" w:eastAsia="宋体"/>
+          <w:color w:val="000000"/>
+        </w:rPr>
+        <w:t xml:space="preserve">6.926416</w:t>
+      </w:r>
+      <w:r>
+        <w:rPr>
+          <w:rFonts w:ascii="宋体" w:hAnsi="宋体" w:eastAsia="宋体"/>
+          <w:color w:val="000000"/>
+        </w:rPr>
+        <w:t xml:space="preserve"> </w:t>
+      </w:r>
+      <w:r>
+        <w:rPr>
+          <w:rFonts w:ascii="宋体" w:hAnsi="宋体" w:eastAsia="宋体"/>
+          <w:color w:val="000000"/>
+        </w:rPr>
+        <w:t xml:space="preserve">min，状态</w:t>
+      </w:r>
+      <w:r>
+        <w:rPr>
+          <w:rFonts w:ascii="宋体" w:hAnsi="宋体" w:eastAsia="宋体"/>
+          <w:color w:val="000000"/>
+        </w:rPr>
+        <w:t xml:space="preserve"> </w:t>
+      </w:r>
+      <w:r>
+        <w:rPr>
+          <w:rStyle w:val="VerbatimChar"/>
+          <w:rFonts w:ascii="宋体" w:hAnsi="宋体" w:eastAsia="宋体"/>
+          <w:color w:val="000000"/>
+        </w:rPr>
+        <w:t xml:space="preserve">PROTOCOL_PASS</w:t>
+      </w:r>
+      <w:r>
+        <w:rPr>
+          <w:rFonts w:ascii="宋体" w:hAnsi="宋体" w:eastAsia="宋体"/>
+          <w:color w:val="000000"/>
+        </w:rPr>
+        <w:t xml:space="preserve">；project Bearing1_3 held-out migration mean true MAE 为</w:t>
+      </w:r>
+      <w:r>
+        <w:rPr>
+          <w:rFonts w:ascii="宋体" w:hAnsi="宋体" w:eastAsia="宋体"/>
+          <w:color w:val="000000"/>
+        </w:rPr>
+        <w:t xml:space="preserve"> </w:t>
+      </w:r>
+      <w:r>
+        <w:rPr>
+          <w:rStyle w:val="VerbatimChar"/>
+          <w:rFonts w:ascii="宋体" w:hAnsi="宋体" w:eastAsia="宋体"/>
+          <w:color w:val="000000"/>
+        </w:rPr>
+        <w:t xml:space="preserve">14.307856</w:t>
+      </w:r>
+      <w:r>
+        <w:rPr>
+          <w:rFonts w:ascii="宋体" w:hAnsi="宋体" w:eastAsia="宋体"/>
+          <w:color w:val="000000"/>
+        </w:rPr>
+        <w:t xml:space="preserve"> </w:t>
+      </w:r>
+      <w:r>
+        <w:rPr>
+          <w:rFonts w:ascii="宋体" w:hAnsi="宋体" w:eastAsia="宋体"/>
+          <w:color w:val="000000"/>
+        </w:rPr>
+        <w:t xml:space="preserve">min，状态</w:t>
+      </w:r>
+      <w:r>
+        <w:rPr>
+          <w:rFonts w:ascii="宋体" w:hAnsi="宋体" w:eastAsia="宋体"/>
+          <w:color w:val="000000"/>
+        </w:rPr>
+        <w:t xml:space="preserve"> </w:t>
+      </w:r>
+      <w:r>
+        <w:rPr>
+          <w:rStyle w:val="VerbatimChar"/>
+          <w:rFonts w:ascii="宋体" w:hAnsi="宋体" w:eastAsia="宋体"/>
+          <w:color w:val="000000"/>
+        </w:rPr>
+        <w:t xml:space="preserve">MIGRATION_PASS</w:t>
+      </w:r>
+      <w:r>
+        <w:rPr>
+          <w:rFonts w:ascii="宋体" w:hAnsi="宋体" w:eastAsia="宋体"/>
+          <w:color w:val="000000"/>
+        </w:rPr>
+        <w:t xml:space="preserve">。</w:t>
+      </w:r>
+    </w:p>
+    <w:p>
+      <w:pPr>
+        <w:numPr>
+          <w:ilvl w:val="0"/>
+          <w:numId w:val="1017"/>
+        </w:numPr>
+        <w:pStyle w:val="Compact"/>
+        <w:spacing w:line="276" w:lineRule="auto" w:after="0"/>
+        <w:ind w:firstLine="420"/>
+      </w:pPr>
+      <w:r>
+        <w:rPr>
+          <w:rFonts w:ascii="宋体" w:hAnsi="宋体" w:eastAsia="宋体"/>
+          <w:color w:val="000000"/>
+        </w:rPr>
+        <w:t xml:space="preserve">RULSurv 口径：held-out pass 依赖</w:t>
+      </w:r>
+      <w:r>
+        <w:rPr>
+          <w:rFonts w:ascii="宋体" w:hAnsi="宋体" w:eastAsia="宋体"/>
+          <w:color w:val="000000"/>
+        </w:rPr>
+        <w:t xml:space="preserve"> </w:t>
+      </w:r>
+      <w:r>
+        <w:rPr>
+          <w:rStyle w:val="VerbatimChar"/>
+          <w:rFonts w:ascii="宋体" w:hAnsi="宋体" w:eastAsia="宋体"/>
+          <w:color w:val="000000"/>
+        </w:rPr>
+        <w:t xml:space="preserve">survival_probability=0.25</w:t>
+      </w:r>
+      <w:r>
+        <w:rPr>
+          <w:rFonts w:ascii="宋体" w:hAnsi="宋体" w:eastAsia="宋体"/>
+          <w:color w:val="000000"/>
+        </w:rPr>
+        <w:t xml:space="preserve"> </w:t>
+      </w:r>
+      <w:r>
+        <w:rPr>
+          <w:rFonts w:ascii="宋体" w:hAnsi="宋体" w:eastAsia="宋体"/>
+          <w:color w:val="000000"/>
+        </w:rPr>
+        <w:t xml:space="preserve">的保守解码，是项目迁移策略，不能说成原始 RULSurv 自然泛化已经完全解决。</w:t>
+      </w:r>
+    </w:p>
+    <w:bookmarkEnd w:id="38"/>
+    <w:bookmarkStart w:id="39" w:name="汇报时间与语气控制"/>
+    <w:p>
+      <w:pPr>
+        <w:pStyle w:val="Heading2"/>
+      </w:pPr>
+      <w:r>
+        <w:rPr>
+          <w:rFonts w:ascii="宋体" w:hAnsi="宋体" w:eastAsia="宋体"/>
+          <w:color w:val="000000"/>
+        </w:rPr>
+        <w:t xml:space="preserve">18. 汇报时间与语气控制</w:t>
       </w:r>
     </w:p>
     <w:tbl>
@@ -2997,7 +3700,7 @@
                 <w:color w:val="000000"/>
                 <w:sz w:val="21"/>
               </w:rPr>
-              <w:t xml:space="preserve">项目目标与数据</w:t>
+              <w:t xml:space="preserve">需求分析与数据集介绍</w:t>
             </w:r>
           </w:p>
         </w:tc>
@@ -3050,7 +3753,7 @@
                 <w:color w:val="000000"/>
                 <w:sz w:val="21"/>
               </w:rPr>
-              <w:t xml:space="preserve">特征与系统设计</w:t>
+              <w:t xml:space="preserve">项目架构与特征分析</w:t>
             </w:r>
           </w:p>
         </w:tc>
@@ -3084,7 +3787,7 @@
                 <w:color w:val="000000"/>
                 <w:sz w:val="21"/>
               </w:rPr>
-              <w:t xml:space="preserve">用数据流说明模块，不把架构讲成抽象口号</w:t>
+              <w:t xml:space="preserve">用数据流说明模块，解释 19 维特征和 tsfresh 弱相关性</w:t>
             </w:r>
           </w:p>
         </w:tc>
@@ -3103,41 +3806,41 @@
                 <w:color w:val="000000"/>
                 <w:sz w:val="21"/>
               </w:rPr>
-              <w:t xml:space="preserve">难点与解决方案</w:t>
-            </w:r>
-          </w:p>
-        </w:tc>
-        <w:tc>
-          <w:p>
-            <w:pPr>
-              <w:pStyle w:val="Compact"/>
-              <w:ind w:firstLine="0"/>
-              <w:jc w:val="left"/>
-            </w:pPr>
-            <w:r>
-              <w:rPr>
-                <w:rFonts w:ascii="宋体" w:hAnsi="宋体" w:eastAsia="宋体"/>
-                <w:color w:val="000000"/>
-                <w:sz w:val="21"/>
-              </w:rPr>
-              <w:t xml:space="preserve">2 分钟</w:t>
-            </w:r>
-          </w:p>
-        </w:tc>
-        <w:tc>
-          <w:p>
-            <w:pPr>
-              <w:pStyle w:val="Compact"/>
-              <w:ind w:firstLine="0"/>
-              <w:jc w:val="left"/>
-            </w:pPr>
-            <w:r>
-              <w:rPr>
-                <w:rFonts w:ascii="宋体" w:hAnsi="宋体" w:eastAsia="宋体"/>
-                <w:color w:val="000000"/>
-                <w:sz w:val="21"/>
-              </w:rPr>
-              <w:t xml:space="preserve">每个难点都说明原因、原理和对应实现</w:t>
+              <w:t xml:space="preserve">训练展示与指标结果</w:t>
+            </w:r>
+          </w:p>
+        </w:tc>
+        <w:tc>
+          <w:p>
+            <w:pPr>
+              <w:pStyle w:val="Compact"/>
+              <w:ind w:firstLine="0"/>
+              <w:jc w:val="left"/>
+            </w:pPr>
+            <w:r>
+              <w:rPr>
+                <w:rFonts w:ascii="宋体" w:hAnsi="宋体" w:eastAsia="宋体"/>
+                <w:color w:val="000000"/>
+                <w:sz w:val="21"/>
+              </w:rPr>
+              <w:t xml:space="preserve">3 分钟</w:t>
+            </w:r>
+          </w:p>
+        </w:tc>
+        <w:tc>
+          <w:p>
+            <w:pPr>
+              <w:pStyle w:val="Compact"/>
+              <w:ind w:firstLine="0"/>
+              <w:jc w:val="left"/>
+            </w:pPr>
+            <w:r>
+              <w:rPr>
+                <w:rFonts w:ascii="宋体" w:hAnsi="宋体" w:eastAsia="宋体"/>
+                <w:color w:val="000000"/>
+                <w:sz w:val="21"/>
+              </w:rPr>
+              <w:t xml:space="preserve">说明论文复现、sktime baseline、RULSurv 两个协议和指标口径</w:t>
             </w:r>
           </w:p>
         </w:tc>
@@ -3156,41 +3859,41 @@
                 <w:color w:val="000000"/>
                 <w:sz w:val="21"/>
               </w:rPr>
-              <w:t xml:space="preserve">论文复现与测试</w:t>
-            </w:r>
-          </w:p>
-        </w:tc>
-        <w:tc>
-          <w:p>
-            <w:pPr>
-              <w:pStyle w:val="Compact"/>
-              <w:ind w:firstLine="0"/>
-              <w:jc w:val="left"/>
-            </w:pPr>
-            <w:r>
-              <w:rPr>
-                <w:rFonts w:ascii="宋体" w:hAnsi="宋体" w:eastAsia="宋体"/>
-                <w:color w:val="000000"/>
-                <w:sz w:val="21"/>
-              </w:rPr>
-              <w:t xml:space="preserve">3 分钟</w:t>
-            </w:r>
-          </w:p>
-        </w:tc>
-        <w:tc>
-          <w:p>
-            <w:pPr>
-              <w:pStyle w:val="Compact"/>
-              <w:ind w:firstLine="0"/>
-              <w:jc w:val="left"/>
-            </w:pPr>
-            <w:r>
-              <w:rPr>
-                <w:rFonts w:ascii="宋体" w:hAnsi="宋体" w:eastAsia="宋体"/>
-                <w:color w:val="000000"/>
-                <w:sz w:val="21"/>
-              </w:rPr>
-              <w:t xml:space="preserve">说明选择依据、复现方式、指标口径和边界</w:t>
+              <w:t xml:space="preserve">不足边界</w:t>
+            </w:r>
+          </w:p>
+        </w:tc>
+        <w:tc>
+          <w:p>
+            <w:pPr>
+              <w:pStyle w:val="Compact"/>
+              <w:ind w:firstLine="0"/>
+              <w:jc w:val="left"/>
+            </w:pPr>
+            <w:r>
+              <w:rPr>
+                <w:rFonts w:ascii="宋体" w:hAnsi="宋体" w:eastAsia="宋体"/>
+                <w:color w:val="000000"/>
+                <w:sz w:val="21"/>
+              </w:rPr>
+              <w:t xml:space="preserve">2 分钟</w:t>
+            </w:r>
+          </w:p>
+        </w:tc>
+        <w:tc>
+          <w:p>
+            <w:pPr>
+              <w:pStyle w:val="Compact"/>
+              <w:ind w:firstLine="0"/>
+              <w:jc w:val="left"/>
+            </w:pPr>
+            <w:r>
+              <w:rPr>
+                <w:rFonts w:ascii="宋体" w:hAnsi="宋体" w:eastAsia="宋体"/>
+                <w:color w:val="000000"/>
+                <w:sz w:val="21"/>
+              </w:rPr>
+              <w:t xml:space="preserve">明确外部 SOTA 未重跑、tsfresh 弱、RULSurv 0.25 保守解码</w:t>
             </w:r>
           </w:p>
         </w:tc>
@@ -3209,7 +3912,7 @@
                 <w:color w:val="000000"/>
                 <w:sz w:val="21"/>
               </w:rPr>
-              <w:t xml:space="preserve">总结与分工</w:t>
+              <w:t xml:space="preserve">总结与 Q&amp;A</w:t>
             </w:r>
           </w:p>
         </w:tc>
@@ -3243,14 +3946,449 @@
                 <w:color w:val="000000"/>
                 <w:sz w:val="21"/>
               </w:rPr>
-              <w:t xml:space="preserve">客观说明贡献、不足和后续改进</w:t>
+              <w:t xml:space="preserve">客观说明完成内容和后续改进</w:t>
             </w:r>
           </w:p>
         </w:tc>
       </w:tr>
     </w:tbl>
-    <w:bookmarkEnd w:id="38"/>
     <w:bookmarkEnd w:id="39"/>
+    <w:bookmarkStart w:id="40" w:name="qa-备答补充"/>
+    <w:p>
+      <w:pPr>
+        <w:pStyle w:val="Heading2"/>
+      </w:pPr>
+      <w:r>
+        <w:rPr>
+          <w:rFonts w:ascii="宋体" w:hAnsi="宋体" w:eastAsia="宋体"/>
+          <w:color w:val="000000"/>
+        </w:rPr>
+        <w:t xml:space="preserve">19. Q&amp;A 备答补充</w:t>
+      </w:r>
+    </w:p>
+    <w:p>
+      <w:pPr>
+        <w:numPr>
+          <w:ilvl w:val="0"/>
+          <w:numId w:val="1018"/>
+        </w:numPr>
+        <w:pStyle w:val="Compact"/>
+        <w:spacing w:line="276" w:lineRule="auto" w:after="0"/>
+        <w:ind w:firstLine="420"/>
+      </w:pPr>
+      <w:r>
+        <w:rPr>
+          <w:rFonts w:ascii="宋体" w:hAnsi="宋体" w:eastAsia="宋体"/>
+          <w:color w:val="000000"/>
+        </w:rPr>
+        <w:t xml:space="preserve">老师问</w:t>
+      </w:r>
+      <w:r>
+        <w:rPr>
+          <w:rFonts w:ascii="宋体" w:hAnsi="宋体" w:eastAsia="宋体"/>
+          <w:color w:val="000000"/>
+        </w:rPr>
+        <w:t xml:space="preserve">“</w:t>
+      </w:r>
+      <w:r>
+        <w:rPr>
+          <w:rFonts w:ascii="宋体" w:hAnsi="宋体" w:eastAsia="宋体"/>
+          <w:color w:val="000000"/>
+        </w:rPr>
+        <w:t xml:space="preserve">你们是不是追上外部 SOTA</w:t>
+      </w:r>
+      <w:r>
+        <w:rPr>
+          <w:rFonts w:ascii="宋体" w:hAnsi="宋体" w:eastAsia="宋体"/>
+          <w:color w:val="000000"/>
+        </w:rPr>
+        <w:t xml:space="preserve">”</w:t>
+      </w:r>
+      <w:r>
+        <w:rPr>
+          <w:rFonts w:ascii="宋体" w:hAnsi="宋体" w:eastAsia="宋体"/>
+          <w:color w:val="000000"/>
+        </w:rPr>
+        <w:t xml:space="preserve">：回答</w:t>
+      </w:r>
+      <w:r>
+        <w:rPr>
+          <w:rFonts w:ascii="宋体" w:hAnsi="宋体" w:eastAsia="宋体"/>
+          <w:color w:val="000000"/>
+        </w:rPr>
+        <w:t xml:space="preserve">“</w:t>
+      </w:r>
+      <w:r>
+        <w:rPr>
+          <w:rFonts w:ascii="宋体" w:hAnsi="宋体" w:eastAsia="宋体"/>
+          <w:color w:val="000000"/>
+        </w:rPr>
+        <w:t xml:space="preserve">没有。外部 SOTA 已完成 source pin、依赖 probe 和复现路径设计，但 AutoRUL、GNN、Weibull 尚未在本地跑出指标。</w:t>
+      </w:r>
+      <w:r>
+        <w:rPr>
+          <w:rFonts w:ascii="宋体" w:hAnsi="宋体" w:eastAsia="宋体"/>
+          <w:color w:val="000000"/>
+        </w:rPr>
+        <w:t xml:space="preserve">”</w:t>
+      </w:r>
+    </w:p>
+    <w:p>
+      <w:pPr>
+        <w:numPr>
+          <w:ilvl w:val="0"/>
+          <w:numId w:val="1018"/>
+        </w:numPr>
+        <w:pStyle w:val="Compact"/>
+        <w:spacing w:line="276" w:lineRule="auto" w:after="0"/>
+        <w:ind w:firstLine="420"/>
+      </w:pPr>
+      <w:r>
+        <w:rPr>
+          <w:rFonts w:ascii="宋体" w:hAnsi="宋体" w:eastAsia="宋体"/>
+          <w:color w:val="000000"/>
+        </w:rPr>
+        <w:t xml:space="preserve">老师问</w:t>
+      </w:r>
+      <w:r>
+        <w:rPr>
+          <w:rFonts w:ascii="宋体" w:hAnsi="宋体" w:eastAsia="宋体"/>
+          <w:color w:val="000000"/>
+        </w:rPr>
+        <w:t xml:space="preserve">“</w:t>
+      </w:r>
+      <w:r>
+        <w:rPr>
+          <w:rFonts w:ascii="宋体" w:hAnsi="宋体" w:eastAsia="宋体"/>
+          <w:color w:val="000000"/>
+        </w:rPr>
+        <w:t xml:space="preserve">tsfresh 是否带来强特征发现</w:t>
+      </w:r>
+      <w:r>
+        <w:rPr>
+          <w:rFonts w:ascii="宋体" w:hAnsi="宋体" w:eastAsia="宋体"/>
+          <w:color w:val="000000"/>
+        </w:rPr>
+        <w:t xml:space="preserve">”</w:t>
+      </w:r>
+      <w:r>
+        <w:rPr>
+          <w:rFonts w:ascii="宋体" w:hAnsi="宋体" w:eastAsia="宋体"/>
+          <w:color w:val="000000"/>
+        </w:rPr>
+        <w:t xml:space="preserve">：回答</w:t>
+      </w:r>
+      <w:r>
+        <w:rPr>
+          <w:rFonts w:ascii="宋体" w:hAnsi="宋体" w:eastAsia="宋体"/>
+          <w:color w:val="000000"/>
+        </w:rPr>
+        <w:t xml:space="preserve">“</w:t>
+      </w:r>
+      <w:r>
+        <w:rPr>
+          <w:rFonts w:ascii="宋体" w:hAnsi="宋体" w:eastAsia="宋体"/>
+          <w:color w:val="000000"/>
+        </w:rPr>
+        <w:t xml:space="preserve">没有包装成强突破。MinimalFCParameters 下 top correlation 约</w:t>
+      </w:r>
+      <w:r>
+        <w:rPr>
+          <w:rFonts w:ascii="宋体" w:hAnsi="宋体" w:eastAsia="宋体"/>
+          <w:color w:val="000000"/>
+        </w:rPr>
+        <w:t xml:space="preserve"> </w:t>
+      </w:r>
+      <w:r>
+        <w:rPr>
+          <w:rStyle w:val="VerbatimChar"/>
+          <w:rFonts w:ascii="宋体" w:hAnsi="宋体" w:eastAsia="宋体"/>
+          <w:color w:val="000000"/>
+        </w:rPr>
+        <w:t xml:space="preserve">0.200994</w:t>
+      </w:r>
+      <w:r>
+        <w:rPr>
+          <w:rFonts w:ascii="宋体" w:hAnsi="宋体" w:eastAsia="宋体"/>
+          <w:color w:val="000000"/>
+        </w:rPr>
+        <w:t xml:space="preserve">，EfficientFCParameters 下 top correlation 提高到</w:t>
+      </w:r>
+      <w:r>
+        <w:rPr>
+          <w:rFonts w:ascii="宋体" w:hAnsi="宋体" w:eastAsia="宋体"/>
+          <w:color w:val="000000"/>
+        </w:rPr>
+        <w:t xml:space="preserve"> </w:t>
+      </w:r>
+      <w:r>
+        <w:rPr>
+          <w:rStyle w:val="VerbatimChar"/>
+          <w:rFonts w:ascii="宋体" w:hAnsi="宋体" w:eastAsia="宋体"/>
+          <w:color w:val="000000"/>
+        </w:rPr>
+        <w:t xml:space="preserve">0.424468</w:t>
+      </w:r>
+      <w:r>
+        <w:rPr>
+          <w:rFonts w:ascii="宋体" w:hAnsi="宋体" w:eastAsia="宋体"/>
+          <w:color w:val="000000"/>
+        </w:rPr>
+        <w:t xml:space="preserve">，但 selected/manual+selected 的 RF mean NRMSE 仍在</w:t>
+      </w:r>
+      <w:r>
+        <w:rPr>
+          <w:rFonts w:ascii="宋体" w:hAnsi="宋体" w:eastAsia="宋体"/>
+          <w:color w:val="000000"/>
+        </w:rPr>
+        <w:t xml:space="preserve"> </w:t>
+      </w:r>
+      <w:r>
+        <w:rPr>
+          <w:rStyle w:val="VerbatimChar"/>
+          <w:rFonts w:ascii="宋体" w:hAnsi="宋体" w:eastAsia="宋体"/>
+          <w:color w:val="000000"/>
+        </w:rPr>
+        <w:t xml:space="preserve">0.315629</w:t>
+      </w:r>
+      <w:r>
+        <w:rPr>
+          <w:rFonts w:ascii="宋体" w:hAnsi="宋体" w:eastAsia="宋体"/>
+          <w:color w:val="000000"/>
+        </w:rPr>
+        <w:t xml:space="preserve"> </w:t>
+      </w:r>
+      <w:r>
+        <w:rPr>
+          <w:rFonts w:ascii="宋体" w:hAnsi="宋体" w:eastAsia="宋体"/>
+          <w:color w:val="000000"/>
+        </w:rPr>
+        <w:t xml:space="preserve">到</w:t>
+      </w:r>
+      <w:r>
+        <w:rPr>
+          <w:rFonts w:ascii="宋体" w:hAnsi="宋体" w:eastAsia="宋体"/>
+          <w:color w:val="000000"/>
+        </w:rPr>
+        <w:t xml:space="preserve"> </w:t>
+      </w:r>
+      <w:r>
+        <w:rPr>
+          <w:rStyle w:val="VerbatimChar"/>
+          <w:rFonts w:ascii="宋体" w:hAnsi="宋体" w:eastAsia="宋体"/>
+          <w:color w:val="000000"/>
+        </w:rPr>
+        <w:t xml:space="preserve">0.319927</w:t>
+      </w:r>
+      <w:r>
+        <w:rPr>
+          <w:rFonts w:ascii="宋体" w:hAnsi="宋体" w:eastAsia="宋体"/>
+          <w:color w:val="000000"/>
+        </w:rPr>
+        <w:t xml:space="preserve"> </w:t>
+      </w:r>
+      <w:r>
+        <w:rPr>
+          <w:rFonts w:ascii="宋体" w:hAnsi="宋体" w:eastAsia="宋体"/>
+          <w:color w:val="000000"/>
+        </w:rPr>
+        <w:t xml:space="preserve">区间，弱于 sktime RocketRegressor 的</w:t>
+      </w:r>
+      <w:r>
+        <w:rPr>
+          <w:rFonts w:ascii="宋体" w:hAnsi="宋体" w:eastAsia="宋体"/>
+          <w:color w:val="000000"/>
+        </w:rPr>
+        <w:t xml:space="preserve"> </w:t>
+      </w:r>
+      <w:r>
+        <w:rPr>
+          <w:rStyle w:val="VerbatimChar"/>
+          <w:rFonts w:ascii="宋体" w:hAnsi="宋体" w:eastAsia="宋体"/>
+          <w:color w:val="000000"/>
+        </w:rPr>
+        <w:t xml:space="preserve">0.263706</w:t>
+      </w:r>
+      <w:r>
+        <w:rPr>
+          <w:rFonts w:ascii="宋体" w:hAnsi="宋体" w:eastAsia="宋体"/>
+          <w:color w:val="000000"/>
+        </w:rPr>
+        <w:t xml:space="preserve">。</w:t>
+      </w:r>
+      <w:r>
+        <w:rPr>
+          <w:rFonts w:ascii="宋体" w:hAnsi="宋体" w:eastAsia="宋体"/>
+          <w:color w:val="000000"/>
+        </w:rPr>
+        <w:t xml:space="preserve">”</w:t>
+      </w:r>
+    </w:p>
+    <w:p>
+      <w:pPr>
+        <w:numPr>
+          <w:ilvl w:val="0"/>
+          <w:numId w:val="1018"/>
+        </w:numPr>
+        <w:pStyle w:val="Compact"/>
+        <w:spacing w:line="276" w:lineRule="auto" w:after="0"/>
+        <w:ind w:firstLine="420"/>
+      </w:pPr>
+      <w:r>
+        <w:rPr>
+          <w:rFonts w:ascii="宋体" w:hAnsi="宋体" w:eastAsia="宋体"/>
+          <w:color w:val="000000"/>
+        </w:rPr>
+        <w:t xml:space="preserve">老师问</w:t>
+      </w:r>
+      <w:r>
+        <w:rPr>
+          <w:rFonts w:ascii="宋体" w:hAnsi="宋体" w:eastAsia="宋体"/>
+          <w:color w:val="000000"/>
+        </w:rPr>
+        <w:t xml:space="preserve">“</w:t>
+      </w:r>
+      <w:r>
+        <w:rPr>
+          <w:rFonts w:ascii="宋体" w:hAnsi="宋体" w:eastAsia="宋体"/>
+          <w:color w:val="000000"/>
+        </w:rPr>
+        <w:t xml:space="preserve">RULSurv 是否证明 held-out 泛化完全解决</w:t>
+      </w:r>
+      <w:r>
+        <w:rPr>
+          <w:rFonts w:ascii="宋体" w:hAnsi="宋体" w:eastAsia="宋体"/>
+          <w:color w:val="000000"/>
+        </w:rPr>
+        <w:t xml:space="preserve">”</w:t>
+      </w:r>
+      <w:r>
+        <w:rPr>
+          <w:rFonts w:ascii="宋体" w:hAnsi="宋体" w:eastAsia="宋体"/>
+          <w:color w:val="000000"/>
+        </w:rPr>
+        <w:t xml:space="preserve">：回答</w:t>
+      </w:r>
+      <w:r>
+        <w:rPr>
+          <w:rFonts w:ascii="宋体" w:hAnsi="宋体" w:eastAsia="宋体"/>
+          <w:color w:val="000000"/>
+        </w:rPr>
+        <w:t xml:space="preserve">“</w:t>
+      </w:r>
+      <w:r>
+        <w:rPr>
+          <w:rFonts w:ascii="宋体" w:hAnsi="宋体" w:eastAsia="宋体"/>
+          <w:color w:val="000000"/>
+        </w:rPr>
+        <w:t xml:space="preserve">不是。row-level CV 与 held-out bearing 是两个口径；held-out Bearing1_3 pass 依赖</w:t>
+      </w:r>
+      <w:r>
+        <w:rPr>
+          <w:rFonts w:ascii="宋体" w:hAnsi="宋体" w:eastAsia="宋体"/>
+          <w:color w:val="000000"/>
+        </w:rPr>
+        <w:t xml:space="preserve"> </w:t>
+      </w:r>
+      <w:r>
+        <w:rPr>
+          <w:rStyle w:val="VerbatimChar"/>
+          <w:rFonts w:ascii="宋体" w:hAnsi="宋体" w:eastAsia="宋体"/>
+          <w:color w:val="000000"/>
+        </w:rPr>
+        <w:t xml:space="preserve">survival_probability=0.25</w:t>
+      </w:r>
+      <w:r>
+        <w:rPr>
+          <w:rFonts w:ascii="宋体" w:hAnsi="宋体" w:eastAsia="宋体"/>
+          <w:color w:val="000000"/>
+        </w:rPr>
+        <w:t xml:space="preserve"> </w:t>
+      </w:r>
+      <w:r>
+        <w:rPr>
+          <w:rFonts w:ascii="宋体" w:hAnsi="宋体" w:eastAsia="宋体"/>
+          <w:color w:val="000000"/>
+        </w:rPr>
+        <w:t xml:space="preserve">的保守解码，是项目迁移策略。</w:t>
+      </w:r>
+      <w:r>
+        <w:rPr>
+          <w:rFonts w:ascii="宋体" w:hAnsi="宋体" w:eastAsia="宋体"/>
+          <w:color w:val="000000"/>
+        </w:rPr>
+        <w:t xml:space="preserve">”</w:t>
+      </w:r>
+    </w:p>
+    <w:p>
+      <w:pPr>
+        <w:numPr>
+          <w:ilvl w:val="0"/>
+          <w:numId w:val="1018"/>
+        </w:numPr>
+        <w:pStyle w:val="Compact"/>
+        <w:spacing w:line="276" w:lineRule="auto" w:after="0"/>
+        <w:ind w:firstLine="420"/>
+      </w:pPr>
+      <w:r>
+        <w:rPr>
+          <w:rFonts w:ascii="宋体" w:hAnsi="宋体" w:eastAsia="宋体"/>
+          <w:color w:val="000000"/>
+        </w:rPr>
+        <w:t xml:space="preserve">老师问</w:t>
+      </w:r>
+      <w:r>
+        <w:rPr>
+          <w:rFonts w:ascii="宋体" w:hAnsi="宋体" w:eastAsia="宋体"/>
+          <w:color w:val="000000"/>
+        </w:rPr>
+        <w:t xml:space="preserve">“</w:t>
+      </w:r>
+      <w:r>
+        <w:rPr>
+          <w:rFonts w:ascii="宋体" w:hAnsi="宋体" w:eastAsia="宋体"/>
+          <w:color w:val="000000"/>
+        </w:rPr>
+        <w:t xml:space="preserve">测试数为什么变了</w:t>
+      </w:r>
+      <w:r>
+        <w:rPr>
+          <w:rFonts w:ascii="宋体" w:hAnsi="宋体" w:eastAsia="宋体"/>
+          <w:color w:val="000000"/>
+        </w:rPr>
+        <w:t xml:space="preserve">”</w:t>
+      </w:r>
+      <w:r>
+        <w:rPr>
+          <w:rFonts w:ascii="宋体" w:hAnsi="宋体" w:eastAsia="宋体"/>
+          <w:color w:val="000000"/>
+        </w:rPr>
+        <w:t xml:space="preserve">：回答</w:t>
+      </w:r>
+      <w:r>
+        <w:rPr>
+          <w:rFonts w:ascii="宋体" w:hAnsi="宋体" w:eastAsia="宋体"/>
+          <w:color w:val="000000"/>
+        </w:rPr>
+        <w:t xml:space="preserve">“</w:t>
+      </w:r>
+      <w:r>
+        <w:rPr>
+          <w:rFonts w:ascii="宋体" w:hAnsi="宋体" w:eastAsia="宋体"/>
+          <w:color w:val="000000"/>
+        </w:rPr>
+        <w:t xml:space="preserve">#2 新增 metric-driven evidence 测试、#3 新增 final materials alignment 测试后，全量 pytest 为 59 个测试通过，旧材料中的 39 是过期口径。</w:t>
+      </w:r>
+      <w:r>
+        <w:rPr>
+          <w:rFonts w:ascii="宋体" w:hAnsi="宋体" w:eastAsia="宋体"/>
+          <w:color w:val="000000"/>
+        </w:rPr>
+        <w:t xml:space="preserve">”</w:t>
+      </w:r>
+    </w:p>
+    <w:bookmarkEnd w:id="40"/>
+    <w:bookmarkEnd w:id="41"/>
     <w:sectPr>
       <w:pgMar w:top="1440" w:bottom="1440" w:left="1797" w:right="1797"/>
     </w:sectPr>
@@ -3484,6 +4622,12 @@
     <w:abstractNumId w:val="991"/>
   </w:num>
   <w:num w:numId="1016">
+    <w:abstractNumId w:val="991"/>
+  </w:num>
+  <w:num w:numId="1017">
+    <w:abstractNumId w:val="991"/>
+  </w:num>
+  <w:num w:numId="1018">
     <w:abstractNumId w:val="991"/>
   </w:num>
 </w:numbering>

</xml_diff>